<commit_message>
feat: Adicionando o código para a entrega 6
</commit_message>
<xml_diff>
--- a/atv06/06-Leonardo_Cortes_Filho.docx
+++ b/atv06/06-Leonardo_Cortes_Filho.docx
@@ -86,7 +86,15 @@
           <w:sz w:val="20"/>
           <w:szCs w:val="20"/>
         </w:rPr>
-        <w:t xml:space="preserve">&lt;Nesta seção o participante deverá descrever com suas próprias palavras os temas abordados nas tarefas do card. É importante demonstrar que houve entendimento dos temas, isto mediante evidências com imagens, gráficos e textos originais produzidos por você. Códigos também podem ser referenciados desde que estejam no github ou Notebook entregue junto com o relatório&gt; </w:t>
+        <w:t>A documentação mostrou diretamente como fazer uso de modelos de embedding, modelos focados em converter objetos, ex. Texto, imagens, etc, em vetores númericos com o objetivo de capturar o sentido semântico do objeto. Esse processo resulta em vetores com alto número de dimensões (256+), facilitando buscas contextuais em databases maiores, modelos mais recentes (pelo o que eu pesquisei 2024) conseguem fazer embedding multimodais, podendo converter diferentes tipos de objetos em um me</w:t>
+      </w:r>
+      <w:r>
+        <w:rPr>
+          <w:rFonts w:cs="Arial" w:ascii="Arial" w:hAnsi="Arial"/>
+          <w:sz w:val="20"/>
+          <w:szCs w:val="20"/>
+        </w:rPr>
+        <w:t>smo espaço vetorial, facilitando análise semântica para outros modelos.</w:t>
       </w:r>
     </w:p>
     <w:p>
@@ -135,7 +143,7 @@
           <w:sz w:val="20"/>
           <w:szCs w:val="20"/>
         </w:rPr>
-        <w:t>&lt;Nesta seção o participante deverá descrever as dificuldades encontradas na tarefa e como fez para superá-las.&gt;</w:t>
+        <w:t>Nenhuma dificuldade específica.</w:t>
       </w:r>
     </w:p>
     <w:p>
@@ -171,7 +179,7 @@
     </w:p>
     <w:p>
       <w:pPr>
-        <w:pStyle w:val="Normal"/>
+        <w:pStyle w:val="fastcamp"/>
         <w:rPr>
           <w:rFonts w:ascii="Arial" w:hAnsi="Arial" w:cs="Arial"/>
           <w:sz w:val="20"/>
@@ -179,48 +187,99 @@
         </w:rPr>
       </w:pPr>
       <w:r>
+        <w:rPr/>
+        <w:t>&lt;Nesta seção o participante deverá descrever as suas conclusões sobre os temas abordados nas tarefas do card.&gt;</w:t>
+      </w:r>
+    </w:p>
+    <w:p>
+      <w:pPr>
+        <w:pStyle w:val="Normal"/>
+        <w:rPr>
+          <w:rFonts w:ascii="Arial" w:hAnsi="Arial" w:cs="Arial"/>
+          <w:b/>
+          <w:bCs/>
+        </w:rPr>
+      </w:pPr>
+      <w:r>
+        <w:rPr>
+          <w:rFonts w:cs="Arial" w:ascii="Arial" w:hAnsi="Arial"/>
+          <w:b/>
+          <w:bCs/>
+        </w:rPr>
+      </w:r>
+    </w:p>
+    <w:p>
+      <w:pPr>
+        <w:pStyle w:val="Normal"/>
+        <w:rPr>
+          <w:rFonts w:ascii="Arial" w:hAnsi="Arial" w:cs="Arial"/>
+          <w:b/>
+          <w:bCs/>
+        </w:rPr>
+      </w:pPr>
+      <w:r>
+        <w:rPr>
+          <w:rFonts w:cs="Arial" w:ascii="Arial" w:hAnsi="Arial"/>
+          <w:b/>
+          <w:bCs/>
+        </w:rPr>
+        <w:t>Referencias</w:t>
+      </w:r>
+    </w:p>
+    <w:p>
+      <w:pPr>
+        <w:pStyle w:val="Normal"/>
+        <w:spacing w:before="0" w:after="160"/>
+        <w:rPr>
+          <w:rFonts w:ascii="Arial" w:hAnsi="Arial" w:cs="Arial"/>
+          <w:sz w:val="20"/>
+          <w:szCs w:val="20"/>
+        </w:rPr>
+      </w:pPr>
+      <w:r>
         <w:rPr>
           <w:rFonts w:cs="Arial" w:ascii="Arial" w:hAnsi="Arial"/>
           <w:sz w:val="20"/>
           <w:szCs w:val="20"/>
         </w:rPr>
-        <w:t>&lt;Nesta seção o participante deverá descrever as suas conclusões sobre os temas abordados nas tarefas do card.&gt;</w:t>
-      </w:r>
-    </w:p>
-    <w:p>
-      <w:pPr>
-        <w:pStyle w:val="Normal"/>
-        <w:rPr>
-          <w:rFonts w:ascii="Arial" w:hAnsi="Arial" w:cs="Arial"/>
-          <w:b/>
-          <w:bCs/>
-        </w:rPr>
-      </w:pPr>
-      <w:r>
-        <w:rPr>
-          <w:rFonts w:cs="Arial" w:ascii="Arial" w:hAnsi="Arial"/>
-          <w:b/>
-          <w:bCs/>
-        </w:rPr>
-      </w:r>
-    </w:p>
-    <w:p>
-      <w:pPr>
-        <w:pStyle w:val="Normal"/>
-        <w:rPr>
-          <w:rFonts w:ascii="Arial" w:hAnsi="Arial" w:cs="Arial"/>
-          <w:b/>
-          <w:bCs/>
-        </w:rPr>
-      </w:pPr>
-      <w:r>
-        <w:rPr>
-          <w:rFonts w:cs="Arial" w:ascii="Arial" w:hAnsi="Arial"/>
-          <w:b/>
-          <w:bCs/>
-        </w:rPr>
-        <w:t>Referencias</w:t>
-      </w:r>
+        <w:t>Do card:</w:t>
+      </w:r>
+    </w:p>
+    <w:p>
+      <w:pPr>
+        <w:pStyle w:val="fastcamp"/>
+        <w:numPr>
+          <w:ilvl w:val="0"/>
+          <w:numId w:val="2"/>
+        </w:numPr>
+        <w:rPr/>
+      </w:pPr>
+      <w:hyperlink r:id="rId3">
+        <w:r>
+          <w:rPr>
+            <w:rStyle w:val="Hyperlink"/>
+          </w:rPr>
+          <w:t>https://qdrant.tech/documentation/cloud-quickstart/</w:t>
+        </w:r>
+      </w:hyperlink>
+    </w:p>
+    <w:p>
+      <w:pPr>
+        <w:pStyle w:val="fastcamp"/>
+        <w:numPr>
+          <w:ilvl w:val="0"/>
+          <w:numId w:val="2"/>
+        </w:numPr>
+        <w:rPr/>
+      </w:pPr>
+      <w:hyperlink r:id="rId4">
+        <w:r>
+          <w:rPr>
+            <w:rStyle w:val="Hyperlink"/>
+          </w:rPr>
+          <w:t>https://www.youtube.com/watch?v=cCDAY0nb0T0</w:t>
+        </w:r>
+      </w:hyperlink>
     </w:p>
     <w:p>
       <w:pPr>
@@ -238,7 +297,93 @@
           <w:sz w:val="20"/>
           <w:szCs w:val="20"/>
         </w:rPr>
-        <w:t>&lt; Nesta seção deveram ser descritas as referências utilizadas para o desenvolvimento do relatório. Caso tenham sido utilizadas outras referências além das do card, também deveram estar descritas.&gt;</w:t>
+        <w:t>Externas:</w:t>
+      </w:r>
+    </w:p>
+    <w:p>
+      <w:pPr>
+        <w:pStyle w:val="fastcamp"/>
+        <w:numPr>
+          <w:ilvl w:val="0"/>
+          <w:numId w:val="3"/>
+        </w:numPr>
+        <w:rPr/>
+      </w:pPr>
+      <w:hyperlink r:id="rId6">
+        <w:r>
+          <w:rPr>
+            <w:rStyle w:val="Hyperlink"/>
+          </w:rPr>
+          <w:t>https://qdrant.tech/documentation/concepts/vectors/</w:t>
+        </w:r>
+      </w:hyperlink>
+    </w:p>
+    <w:p>
+      <w:pPr>
+        <w:pStyle w:val="fastcamp"/>
+        <w:numPr>
+          <w:ilvl w:val="0"/>
+          <w:numId w:val="3"/>
+        </w:numPr>
+        <w:rPr/>
+      </w:pPr>
+      <w:hyperlink r:id="rId8">
+        <w:r>
+          <w:rPr>
+            <w:rStyle w:val="Hyperlink"/>
+          </w:rPr>
+          <w:t>https://qdrant.tech/documentation/concepts/search/</w:t>
+        </w:r>
+      </w:hyperlink>
+    </w:p>
+    <w:p>
+      <w:pPr>
+        <w:pStyle w:val="fastcamp"/>
+        <w:numPr>
+          <w:ilvl w:val="0"/>
+          <w:numId w:val="3"/>
+        </w:numPr>
+        <w:rPr/>
+      </w:pPr>
+      <w:hyperlink r:id="rId10">
+        <w:r>
+          <w:rPr>
+            <w:rStyle w:val="Hyperlink"/>
+          </w:rPr>
+          <w:t>https://medium.com/@fr4nk/qdrant-create-collection-api-deep-dive-engineering-high-performance-vector-collections-fab57e6285a0</w:t>
+        </w:r>
+      </w:hyperlink>
+    </w:p>
+    <w:p>
+      <w:pPr>
+        <w:pStyle w:val="fastcamp"/>
+        <w:numPr>
+          <w:ilvl w:val="0"/>
+          <w:numId w:val="3"/>
+        </w:numPr>
+        <w:rPr/>
+      </w:pPr>
+      <w:hyperlink r:id="rId12">
+        <w:r>
+          <w:rPr>
+            <w:rStyle w:val="Hyperlink"/>
+          </w:rPr>
+          <w:t>https://towardsdatascience.com/multimodal-embeddings-an-introduction-5dc36975966f/</w:t>
+        </w:r>
+      </w:hyperlink>
+    </w:p>
+    <w:p>
+      <w:pPr>
+        <w:pStyle w:val="fastcamp"/>
+        <w:numPr>
+          <w:ilvl w:val="0"/>
+          <w:numId w:val="3"/>
+        </w:numPr>
+        <w:spacing w:before="0" w:after="160"/>
+        <w:rPr/>
+      </w:pPr>
+      <w:r>
+        <w:rPr/>
       </w:r>
     </w:p>
     <w:sectPr>
@@ -252,6 +397,413 @@
     </w:sectPr>
   </w:body>
 </w:document>
+</file>
+
+<file path=word/numbering.xml><?xml version="1.0" encoding="utf-8"?>
+<w:numbering xmlns:w="http://schemas.openxmlformats.org/wordprocessingml/2006/main" xmlns:o="urn:schemas-microsoft-com:office:office" xmlns:r="http://schemas.openxmlformats.org/officeDocument/2006/relationships" xmlns:v="urn:schemas-microsoft-com:vml" xmlns:mc="http://schemas.openxmlformats.org/markup-compatibility/2006" xmlns:w14="http://schemas.microsoft.com/office/word/2010/wordml" mc:Ignorable="w14">
+  <w:abstractNum w:abstractNumId="1">
+    <w:lvl w:ilvl="0">
+      <w:start w:val="1"/>
+      <w:numFmt w:val="none"/>
+      <w:suff w:val="nothing"/>
+      <w:lvlText w:val=""/>
+      <w:lvlJc w:val="left"/>
+      <w:pPr>
+        <w:tabs>
+          <w:tab w:val="num" w:pos="0"/>
+        </w:tabs>
+        <w:ind w:left="0" w:hanging="0"/>
+      </w:pPr>
+    </w:lvl>
+    <w:lvl w:ilvl="1">
+      <w:start w:val="1"/>
+      <w:numFmt w:val="none"/>
+      <w:suff w:val="nothing"/>
+      <w:lvlText w:val=""/>
+      <w:lvlJc w:val="left"/>
+      <w:pPr>
+        <w:tabs>
+          <w:tab w:val="num" w:pos="0"/>
+        </w:tabs>
+        <w:ind w:left="0" w:hanging="0"/>
+      </w:pPr>
+    </w:lvl>
+    <w:lvl w:ilvl="2">
+      <w:start w:val="1"/>
+      <w:numFmt w:val="none"/>
+      <w:suff w:val="nothing"/>
+      <w:lvlText w:val=""/>
+      <w:lvlJc w:val="left"/>
+      <w:pPr>
+        <w:tabs>
+          <w:tab w:val="num" w:pos="0"/>
+        </w:tabs>
+        <w:ind w:left="0" w:hanging="0"/>
+      </w:pPr>
+    </w:lvl>
+    <w:lvl w:ilvl="3">
+      <w:start w:val="1"/>
+      <w:numFmt w:val="none"/>
+      <w:suff w:val="nothing"/>
+      <w:lvlText w:val=""/>
+      <w:lvlJc w:val="left"/>
+      <w:pPr>
+        <w:tabs>
+          <w:tab w:val="num" w:pos="0"/>
+        </w:tabs>
+        <w:ind w:left="0" w:hanging="0"/>
+      </w:pPr>
+    </w:lvl>
+    <w:lvl w:ilvl="4">
+      <w:start w:val="1"/>
+      <w:numFmt w:val="none"/>
+      <w:suff w:val="nothing"/>
+      <w:lvlText w:val=""/>
+      <w:lvlJc w:val="left"/>
+      <w:pPr>
+        <w:tabs>
+          <w:tab w:val="num" w:pos="0"/>
+        </w:tabs>
+        <w:ind w:left="0" w:hanging="0"/>
+      </w:pPr>
+    </w:lvl>
+    <w:lvl w:ilvl="5">
+      <w:start w:val="1"/>
+      <w:numFmt w:val="none"/>
+      <w:suff w:val="nothing"/>
+      <w:lvlText w:val=""/>
+      <w:lvlJc w:val="left"/>
+      <w:pPr>
+        <w:tabs>
+          <w:tab w:val="num" w:pos="0"/>
+        </w:tabs>
+        <w:ind w:left="0" w:hanging="0"/>
+      </w:pPr>
+    </w:lvl>
+    <w:lvl w:ilvl="6">
+      <w:start w:val="1"/>
+      <w:numFmt w:val="none"/>
+      <w:suff w:val="nothing"/>
+      <w:lvlText w:val=""/>
+      <w:lvlJc w:val="left"/>
+      <w:pPr>
+        <w:tabs>
+          <w:tab w:val="num" w:pos="0"/>
+        </w:tabs>
+        <w:ind w:left="0" w:hanging="0"/>
+      </w:pPr>
+    </w:lvl>
+    <w:lvl w:ilvl="7">
+      <w:start w:val="1"/>
+      <w:numFmt w:val="none"/>
+      <w:suff w:val="nothing"/>
+      <w:lvlText w:val=""/>
+      <w:lvlJc w:val="left"/>
+      <w:pPr>
+        <w:tabs>
+          <w:tab w:val="num" w:pos="0"/>
+        </w:tabs>
+        <w:ind w:left="0" w:hanging="0"/>
+      </w:pPr>
+    </w:lvl>
+    <w:lvl w:ilvl="8">
+      <w:start w:val="1"/>
+      <w:numFmt w:val="none"/>
+      <w:suff w:val="nothing"/>
+      <w:lvlText w:val=""/>
+      <w:lvlJc w:val="left"/>
+      <w:pPr>
+        <w:tabs>
+          <w:tab w:val="num" w:pos="0"/>
+        </w:tabs>
+        <w:ind w:left="0" w:hanging="0"/>
+      </w:pPr>
+    </w:lvl>
+  </w:abstractNum>
+  <w:abstractNum w:abstractNumId="2">
+    <w:lvl w:ilvl="0">
+      <w:start w:val="1"/>
+      <w:numFmt w:val="bullet"/>
+      <w:lvlText w:val=""/>
+      <w:lvlJc w:val="left"/>
+      <w:pPr>
+        <w:tabs>
+          <w:tab w:val="num" w:pos="720"/>
+        </w:tabs>
+        <w:ind w:left="720" w:hanging="360"/>
+      </w:pPr>
+      <w:rPr>
+        <w:rFonts w:ascii="Symbol" w:hAnsi="Symbol" w:cs="Symbol" w:hint="default"/>
+      </w:rPr>
+    </w:lvl>
+    <w:lvl w:ilvl="1">
+      <w:start w:val="1"/>
+      <w:numFmt w:val="bullet"/>
+      <w:lvlText w:val="◦"/>
+      <w:lvlJc w:val="left"/>
+      <w:pPr>
+        <w:tabs>
+          <w:tab w:val="num" w:pos="1080"/>
+        </w:tabs>
+        <w:ind w:left="1080" w:hanging="360"/>
+      </w:pPr>
+      <w:rPr>
+        <w:rFonts w:ascii="OpenSymbol" w:hAnsi="OpenSymbol" w:cs="OpenSymbol" w:hint="default"/>
+      </w:rPr>
+    </w:lvl>
+    <w:lvl w:ilvl="2">
+      <w:start w:val="1"/>
+      <w:numFmt w:val="bullet"/>
+      <w:lvlText w:val="▪"/>
+      <w:lvlJc w:val="left"/>
+      <w:pPr>
+        <w:tabs>
+          <w:tab w:val="num" w:pos="1440"/>
+        </w:tabs>
+        <w:ind w:left="1440" w:hanging="360"/>
+      </w:pPr>
+      <w:rPr>
+        <w:rFonts w:ascii="OpenSymbol" w:hAnsi="OpenSymbol" w:cs="OpenSymbol" w:hint="default"/>
+      </w:rPr>
+    </w:lvl>
+    <w:lvl w:ilvl="3">
+      <w:start w:val="1"/>
+      <w:numFmt w:val="bullet"/>
+      <w:lvlText w:val=""/>
+      <w:lvlJc w:val="left"/>
+      <w:pPr>
+        <w:tabs>
+          <w:tab w:val="num" w:pos="1800"/>
+        </w:tabs>
+        <w:ind w:left="1800" w:hanging="360"/>
+      </w:pPr>
+      <w:rPr>
+        <w:rFonts w:ascii="Symbol" w:hAnsi="Symbol" w:cs="Symbol" w:hint="default"/>
+      </w:rPr>
+    </w:lvl>
+    <w:lvl w:ilvl="4">
+      <w:start w:val="1"/>
+      <w:numFmt w:val="bullet"/>
+      <w:lvlText w:val="◦"/>
+      <w:lvlJc w:val="left"/>
+      <w:pPr>
+        <w:tabs>
+          <w:tab w:val="num" w:pos="2160"/>
+        </w:tabs>
+        <w:ind w:left="2160" w:hanging="360"/>
+      </w:pPr>
+      <w:rPr>
+        <w:rFonts w:ascii="OpenSymbol" w:hAnsi="OpenSymbol" w:cs="OpenSymbol" w:hint="default"/>
+      </w:rPr>
+    </w:lvl>
+    <w:lvl w:ilvl="5">
+      <w:start w:val="1"/>
+      <w:numFmt w:val="bullet"/>
+      <w:lvlText w:val="▪"/>
+      <w:lvlJc w:val="left"/>
+      <w:pPr>
+        <w:tabs>
+          <w:tab w:val="num" w:pos="2520"/>
+        </w:tabs>
+        <w:ind w:left="2520" w:hanging="360"/>
+      </w:pPr>
+      <w:rPr>
+        <w:rFonts w:ascii="OpenSymbol" w:hAnsi="OpenSymbol" w:cs="OpenSymbol" w:hint="default"/>
+      </w:rPr>
+    </w:lvl>
+    <w:lvl w:ilvl="6">
+      <w:start w:val="1"/>
+      <w:numFmt w:val="bullet"/>
+      <w:lvlText w:val=""/>
+      <w:lvlJc w:val="left"/>
+      <w:pPr>
+        <w:tabs>
+          <w:tab w:val="num" w:pos="2880"/>
+        </w:tabs>
+        <w:ind w:left="2880" w:hanging="360"/>
+      </w:pPr>
+      <w:rPr>
+        <w:rFonts w:ascii="Symbol" w:hAnsi="Symbol" w:cs="Symbol" w:hint="default"/>
+      </w:rPr>
+    </w:lvl>
+    <w:lvl w:ilvl="7">
+      <w:start w:val="1"/>
+      <w:numFmt w:val="bullet"/>
+      <w:lvlText w:val="◦"/>
+      <w:lvlJc w:val="left"/>
+      <w:pPr>
+        <w:tabs>
+          <w:tab w:val="num" w:pos="3240"/>
+        </w:tabs>
+        <w:ind w:left="3240" w:hanging="360"/>
+      </w:pPr>
+      <w:rPr>
+        <w:rFonts w:ascii="OpenSymbol" w:hAnsi="OpenSymbol" w:cs="OpenSymbol" w:hint="default"/>
+      </w:rPr>
+    </w:lvl>
+    <w:lvl w:ilvl="8">
+      <w:start w:val="1"/>
+      <w:numFmt w:val="bullet"/>
+      <w:lvlText w:val="▪"/>
+      <w:lvlJc w:val="left"/>
+      <w:pPr>
+        <w:tabs>
+          <w:tab w:val="num" w:pos="3600"/>
+        </w:tabs>
+        <w:ind w:left="3600" w:hanging="360"/>
+      </w:pPr>
+      <w:rPr>
+        <w:rFonts w:ascii="OpenSymbol" w:hAnsi="OpenSymbol" w:cs="OpenSymbol" w:hint="default"/>
+      </w:rPr>
+    </w:lvl>
+  </w:abstractNum>
+  <w:abstractNum w:abstractNumId="3">
+    <w:lvl w:ilvl="0">
+      <w:start w:val="1"/>
+      <w:numFmt w:val="bullet"/>
+      <w:lvlText w:val=""/>
+      <w:lvlJc w:val="left"/>
+      <w:pPr>
+        <w:tabs>
+          <w:tab w:val="num" w:pos="720"/>
+        </w:tabs>
+        <w:ind w:left="720" w:hanging="360"/>
+      </w:pPr>
+      <w:rPr>
+        <w:rFonts w:ascii="Symbol" w:hAnsi="Symbol" w:cs="Symbol" w:hint="default"/>
+      </w:rPr>
+    </w:lvl>
+    <w:lvl w:ilvl="1">
+      <w:start w:val="1"/>
+      <w:numFmt w:val="bullet"/>
+      <w:lvlText w:val="◦"/>
+      <w:lvlJc w:val="left"/>
+      <w:pPr>
+        <w:tabs>
+          <w:tab w:val="num" w:pos="1080"/>
+        </w:tabs>
+        <w:ind w:left="1080" w:hanging="360"/>
+      </w:pPr>
+      <w:rPr>
+        <w:rFonts w:ascii="OpenSymbol" w:hAnsi="OpenSymbol" w:cs="OpenSymbol" w:hint="default"/>
+      </w:rPr>
+    </w:lvl>
+    <w:lvl w:ilvl="2">
+      <w:start w:val="1"/>
+      <w:numFmt w:val="bullet"/>
+      <w:lvlText w:val="▪"/>
+      <w:lvlJc w:val="left"/>
+      <w:pPr>
+        <w:tabs>
+          <w:tab w:val="num" w:pos="1440"/>
+        </w:tabs>
+        <w:ind w:left="1440" w:hanging="360"/>
+      </w:pPr>
+      <w:rPr>
+        <w:rFonts w:ascii="OpenSymbol" w:hAnsi="OpenSymbol" w:cs="OpenSymbol" w:hint="default"/>
+      </w:rPr>
+    </w:lvl>
+    <w:lvl w:ilvl="3">
+      <w:start w:val="1"/>
+      <w:numFmt w:val="bullet"/>
+      <w:lvlText w:val=""/>
+      <w:lvlJc w:val="left"/>
+      <w:pPr>
+        <w:tabs>
+          <w:tab w:val="num" w:pos="1800"/>
+        </w:tabs>
+        <w:ind w:left="1800" w:hanging="360"/>
+      </w:pPr>
+      <w:rPr>
+        <w:rFonts w:ascii="Symbol" w:hAnsi="Symbol" w:cs="Symbol" w:hint="default"/>
+      </w:rPr>
+    </w:lvl>
+    <w:lvl w:ilvl="4">
+      <w:start w:val="1"/>
+      <w:numFmt w:val="bullet"/>
+      <w:lvlText w:val="◦"/>
+      <w:lvlJc w:val="left"/>
+      <w:pPr>
+        <w:tabs>
+          <w:tab w:val="num" w:pos="2160"/>
+        </w:tabs>
+        <w:ind w:left="2160" w:hanging="360"/>
+      </w:pPr>
+      <w:rPr>
+        <w:rFonts w:ascii="OpenSymbol" w:hAnsi="OpenSymbol" w:cs="OpenSymbol" w:hint="default"/>
+      </w:rPr>
+    </w:lvl>
+    <w:lvl w:ilvl="5">
+      <w:start w:val="1"/>
+      <w:numFmt w:val="bullet"/>
+      <w:lvlText w:val="▪"/>
+      <w:lvlJc w:val="left"/>
+      <w:pPr>
+        <w:tabs>
+          <w:tab w:val="num" w:pos="2520"/>
+        </w:tabs>
+        <w:ind w:left="2520" w:hanging="360"/>
+      </w:pPr>
+      <w:rPr>
+        <w:rFonts w:ascii="OpenSymbol" w:hAnsi="OpenSymbol" w:cs="OpenSymbol" w:hint="default"/>
+      </w:rPr>
+    </w:lvl>
+    <w:lvl w:ilvl="6">
+      <w:start w:val="1"/>
+      <w:numFmt w:val="bullet"/>
+      <w:lvlText w:val=""/>
+      <w:lvlJc w:val="left"/>
+      <w:pPr>
+        <w:tabs>
+          <w:tab w:val="num" w:pos="2880"/>
+        </w:tabs>
+        <w:ind w:left="2880" w:hanging="360"/>
+      </w:pPr>
+      <w:rPr>
+        <w:rFonts w:ascii="Symbol" w:hAnsi="Symbol" w:cs="Symbol" w:hint="default"/>
+      </w:rPr>
+    </w:lvl>
+    <w:lvl w:ilvl="7">
+      <w:start w:val="1"/>
+      <w:numFmt w:val="bullet"/>
+      <w:lvlText w:val="◦"/>
+      <w:lvlJc w:val="left"/>
+      <w:pPr>
+        <w:tabs>
+          <w:tab w:val="num" w:pos="3240"/>
+        </w:tabs>
+        <w:ind w:left="3240" w:hanging="360"/>
+      </w:pPr>
+      <w:rPr>
+        <w:rFonts w:ascii="OpenSymbol" w:hAnsi="OpenSymbol" w:cs="OpenSymbol" w:hint="default"/>
+      </w:rPr>
+    </w:lvl>
+    <w:lvl w:ilvl="8">
+      <w:start w:val="1"/>
+      <w:numFmt w:val="bullet"/>
+      <w:lvlText w:val="▪"/>
+      <w:lvlJc w:val="left"/>
+      <w:pPr>
+        <w:tabs>
+          <w:tab w:val="num" w:pos="3600"/>
+        </w:tabs>
+        <w:ind w:left="3600" w:hanging="360"/>
+      </w:pPr>
+      <w:rPr>
+        <w:rFonts w:ascii="OpenSymbol" w:hAnsi="OpenSymbol" w:cs="OpenSymbol" w:hint="default"/>
+      </w:rPr>
+    </w:lvl>
+  </w:abstractNum>
+  <w:num w:numId="1">
+    <w:abstractNumId w:val="1"/>
+  </w:num>
+  <w:num w:numId="2">
+    <w:abstractNumId w:val="2"/>
+  </w:num>
+  <w:num w:numId="3">
+    <w:abstractNumId w:val="3"/>
+  </w:num>
+</w:numbering>
 </file>
 
 <file path=word/styles.xml><?xml version="1.0" encoding="utf-8"?>
@@ -680,6 +1232,20 @@
     <w:qFormat/>
     <w:rPr/>
   </w:style>
+  <w:style w:type="character" w:styleId="Bullets">
+    <w:name w:val="Bullets"/>
+    <w:qFormat/>
+    <w:rPr>
+      <w:rFonts w:ascii="OpenSymbol" w:hAnsi="OpenSymbol" w:eastAsia="OpenSymbol" w:cs="OpenSymbol"/>
+    </w:rPr>
+  </w:style>
+  <w:style w:type="character" w:styleId="Hyperlink">
+    <w:name w:val="Hyperlink"/>
+    <w:rPr>
+      <w:color w:val="000080"/>
+      <w:u w:val="single"/>
+    </w:rPr>
+  </w:style>
   <w:style w:type="paragraph" w:styleId="Heading">
     <w:name w:val="Heading"/>
     <w:basedOn w:val="Normal"/>
@@ -736,6 +1302,16 @@
     </w:pPr>
     <w:rPr>
       <w:rFonts w:cs="Noto Sans Devanagari"/>
+    </w:rPr>
+  </w:style>
+  <w:style w:type="paragraph" w:styleId="fastcamp">
+    <w:name w:val="fastcamp"/>
+    <w:basedOn w:val="Normal"/>
+    <w:qFormat/>
+    <w:pPr/>
+    <w:rPr>
+      <w:rFonts w:ascii="arial" w:hAnsi="arial"/>
+      <w:sz w:val="20"/>
     </w:rPr>
   </w:style>
   <w:style w:type="numbering" w:styleId="NoList" w:default="1">

</xml_diff>

<commit_message>
docs: iniciando entrega 6
</commit_message>
<xml_diff>
--- a/atv06/06-Leonardo_Cortes_Filho.docx
+++ b/atv06/06-Leonardo_Cortes_Filho.docx
@@ -86,15 +86,56 @@
           <w:sz w:val="20"/>
           <w:szCs w:val="20"/>
         </w:rPr>
-        <w:t>A documentação mostrou diretamente como fazer uso de modelos de embedding, modelos focados em converter objetos, ex. Texto, imagens, etc, em vetores númericos com o objetivo de capturar o sentido semântico do objeto. Esse processo resulta em vetores com alto número de dimensões (256+), facilitando buscas contextuais em databases maiores, modelos mais recentes (pelo o que eu pesquisei 2024) conseguem fazer embedding multimodais, podendo converter diferentes tipos de objetos em um me</w:t>
-      </w:r>
+        <w:t>A documentação mostrou diretamente como fazer uso de modelos de embedding, modelos focados em converter objetos, ex. Texto, imagens, etc, em vetores númericos com o objetivo de capturar o sentido semântico do objeto. Esse processo resulta em vetores com alto número de dimensões (256+), facilitando buscas contextuais em databases maiores, modelos mais recentes (pelo o que eu pesquisei 2024) conseguem fazer embedding multimodais, podendo converter diferentes tipos de objetos em um mesmo espaço vetorial, facilitando análise semântica para outros modelos.</w:t>
+      </w:r>
+    </w:p>
+    <w:p>
+      <w:pPr>
+        <w:pStyle w:val="Normal"/>
+        <w:rPr>
+          <w:rFonts w:ascii="Arial" w:hAnsi="Arial" w:cs="Arial"/>
+        </w:rPr>
+      </w:pPr>
+      <w:r>
+        <w:rPr>
+          <w:rFonts w:cs="Arial" w:ascii="Arial" w:hAnsi="Arial"/>
+        </w:rPr>
+      </w:r>
+    </w:p>
+    <w:p>
+      <w:pPr>
+        <w:pStyle w:val="Normal"/>
+        <w:rPr>
+          <w:rFonts w:ascii="Arial" w:hAnsi="Arial" w:cs="Arial"/>
+          <w:b/>
+          <w:bCs/>
+        </w:rPr>
+      </w:pPr>
+      <w:r>
+        <w:rPr>
+          <w:rFonts w:cs="Arial" w:ascii="Arial" w:hAnsi="Arial"/>
+          <w:b/>
+          <w:bCs/>
+        </w:rPr>
+        <w:t>Dificuldades</w:t>
+      </w:r>
+    </w:p>
+    <w:p>
+      <w:pPr>
+        <w:pStyle w:val="Normal"/>
+        <w:rPr>
+          <w:rFonts w:ascii="Arial" w:hAnsi="Arial" w:cs="Arial"/>
+          <w:sz w:val="20"/>
+          <w:szCs w:val="20"/>
+        </w:rPr>
+      </w:pPr>
       <w:r>
         <w:rPr>
           <w:rFonts w:cs="Arial" w:ascii="Arial" w:hAnsi="Arial"/>
           <w:sz w:val="20"/>
           <w:szCs w:val="20"/>
         </w:rPr>
-        <w:t>smo espaço vetorial, facilitando análise semântica para outros modelos.</w:t>
+        <w:t>Nenhuma dificuldade específica.</w:t>
       </w:r>
     </w:p>
     <w:p>
@@ -125,12 +166,12 @@
           <w:b/>
           <w:bCs/>
         </w:rPr>
-        <w:t>Dificuldades</w:t>
-      </w:r>
-    </w:p>
-    <w:p>
-      <w:pPr>
-        <w:pStyle w:val="Normal"/>
+        <w:t xml:space="preserve">Conclusões </w:t>
+      </w:r>
+    </w:p>
+    <w:p>
+      <w:pPr>
+        <w:pStyle w:val="fastcamp"/>
         <w:rPr>
           <w:rFonts w:ascii="Arial" w:hAnsi="Arial" w:cs="Arial"/>
           <w:sz w:val="20"/>
@@ -138,110 +179,61 @@
         </w:rPr>
       </w:pPr>
       <w:r>
+        <w:rPr/>
+        <w:t>&lt;Nesta seção o participante deverá descrever as suas conclusões sobre os temas abordados nas tarefas do card.&gt;</w:t>
+      </w:r>
+    </w:p>
+    <w:p>
+      <w:pPr>
+        <w:pStyle w:val="Normal"/>
+        <w:rPr>
+          <w:rFonts w:ascii="Arial" w:hAnsi="Arial" w:cs="Arial"/>
+          <w:b/>
+          <w:bCs/>
+        </w:rPr>
+      </w:pPr>
+      <w:r>
+        <w:rPr>
+          <w:rFonts w:cs="Arial" w:ascii="Arial" w:hAnsi="Arial"/>
+          <w:b/>
+          <w:bCs/>
+        </w:rPr>
+      </w:r>
+    </w:p>
+    <w:p>
+      <w:pPr>
+        <w:pStyle w:val="Normal"/>
+        <w:rPr>
+          <w:rFonts w:ascii="Arial" w:hAnsi="Arial" w:cs="Arial"/>
+          <w:b/>
+          <w:bCs/>
+        </w:rPr>
+      </w:pPr>
+      <w:r>
+        <w:rPr>
+          <w:rFonts w:cs="Arial" w:ascii="Arial" w:hAnsi="Arial"/>
+          <w:b/>
+          <w:bCs/>
+        </w:rPr>
+        <w:t>Referencias</w:t>
+      </w:r>
+    </w:p>
+    <w:p>
+      <w:pPr>
+        <w:pStyle w:val="Normal"/>
+        <w:spacing w:before="0" w:after="160"/>
+        <w:rPr>
+          <w:rFonts w:ascii="Arial" w:hAnsi="Arial" w:cs="Arial"/>
+          <w:sz w:val="20"/>
+          <w:szCs w:val="20"/>
+        </w:rPr>
+      </w:pPr>
+      <w:r>
         <w:rPr>
           <w:rFonts w:cs="Arial" w:ascii="Arial" w:hAnsi="Arial"/>
           <w:sz w:val="20"/>
           <w:szCs w:val="20"/>
         </w:rPr>
-        <w:t>Nenhuma dificuldade específica.</w:t>
-      </w:r>
-    </w:p>
-    <w:p>
-      <w:pPr>
-        <w:pStyle w:val="Normal"/>
-        <w:rPr>
-          <w:rFonts w:ascii="Arial" w:hAnsi="Arial" w:cs="Arial"/>
-        </w:rPr>
-      </w:pPr>
-      <w:r>
-        <w:rPr>
-          <w:rFonts w:cs="Arial" w:ascii="Arial" w:hAnsi="Arial"/>
-        </w:rPr>
-      </w:r>
-    </w:p>
-    <w:p>
-      <w:pPr>
-        <w:pStyle w:val="Normal"/>
-        <w:rPr>
-          <w:rFonts w:ascii="Arial" w:hAnsi="Arial" w:cs="Arial"/>
-          <w:b/>
-          <w:bCs/>
-        </w:rPr>
-      </w:pPr>
-      <w:r>
-        <w:rPr>
-          <w:rFonts w:cs="Arial" w:ascii="Arial" w:hAnsi="Arial"/>
-          <w:b/>
-          <w:bCs/>
-        </w:rPr>
-        <w:t xml:space="preserve">Conclusões </w:t>
-      </w:r>
-    </w:p>
-    <w:p>
-      <w:pPr>
-        <w:pStyle w:val="fastcamp"/>
-        <w:rPr>
-          <w:rFonts w:ascii="Arial" w:hAnsi="Arial" w:cs="Arial"/>
-          <w:sz w:val="20"/>
-          <w:szCs w:val="20"/>
-        </w:rPr>
-      </w:pPr>
-      <w:r>
-        <w:rPr/>
-        <w:t>&lt;Nesta seção o participante deverá descrever as suas conclusões sobre os temas abordados nas tarefas do card.&gt;</w:t>
-      </w:r>
-    </w:p>
-    <w:p>
-      <w:pPr>
-        <w:pStyle w:val="Normal"/>
-        <w:rPr>
-          <w:rFonts w:ascii="Arial" w:hAnsi="Arial" w:cs="Arial"/>
-          <w:b/>
-          <w:bCs/>
-        </w:rPr>
-      </w:pPr>
-      <w:r>
-        <w:rPr>
-          <w:rFonts w:cs="Arial" w:ascii="Arial" w:hAnsi="Arial"/>
-          <w:b/>
-          <w:bCs/>
-        </w:rPr>
-      </w:r>
-    </w:p>
-    <w:p>
-      <w:pPr>
-        <w:pStyle w:val="Normal"/>
-        <w:rPr>
-          <w:rFonts w:ascii="Arial" w:hAnsi="Arial" w:cs="Arial"/>
-          <w:b/>
-          <w:bCs/>
-        </w:rPr>
-      </w:pPr>
-      <w:r>
-        <w:rPr>
-          <w:rFonts w:cs="Arial" w:ascii="Arial" w:hAnsi="Arial"/>
-          <w:b/>
-          <w:bCs/>
-        </w:rPr>
-        <w:t>Referencias</w:t>
-      </w:r>
-    </w:p>
-    <w:p>
-      <w:pPr>
-        <w:pStyle w:val="Normal"/>
-        <w:spacing w:before="0" w:after="160"/>
-        <w:rPr>
-          <w:rFonts w:ascii="Arial" w:hAnsi="Arial" w:cs="Arial"/>
-          <w:sz w:val="20"/>
-          <w:szCs w:val="20"/>
-        </w:rPr>
-      </w:pPr>
-      <w:r>
-        <w:rPr>
-          <w:rFonts w:cs="Arial" w:ascii="Arial" w:hAnsi="Arial"/>
-          <w:sz w:val="20"/>
-          <w:szCs w:val="20"/>
-        </w:rPr>
         <w:t>Do card:</w:t>
       </w:r>
     </w:p>
@@ -250,29 +242,27 @@
         <w:pStyle w:val="fastcamp"/>
         <w:numPr>
           <w:ilvl w:val="0"/>
-          <w:numId w:val="2"/>
+          <w:numId w:val="1"/>
         </w:numPr>
         <w:rPr/>
       </w:pPr>
-      <w:hyperlink r:id="rId3">
-        <w:r>
-          <w:rPr>
-            <w:rStyle w:val="Hyperlink"/>
-          </w:rPr>
-          <w:t>https://qdrant.tech/documentation/cloud-quickstart/</w:t>
-        </w:r>
-      </w:hyperlink>
+      <w:r>
+        <w:rPr>
+          <w:rStyle w:val="Hyperlink"/>
+        </w:rPr>
+        <w:t>https://qdrant.tech/documentation/cloud-quickstart/</w:t>
+      </w:r>
     </w:p>
     <w:p>
       <w:pPr>
         <w:pStyle w:val="fastcamp"/>
         <w:numPr>
           <w:ilvl w:val="0"/>
-          <w:numId w:val="2"/>
+          <w:numId w:val="1"/>
         </w:numPr>
         <w:rPr/>
       </w:pPr>
-      <w:hyperlink r:id="rId4">
+      <w:hyperlink r:id="rId2">
         <w:r>
           <w:rPr>
             <w:rStyle w:val="Hyperlink"/>
@@ -305,79 +295,71 @@
         <w:pStyle w:val="fastcamp"/>
         <w:numPr>
           <w:ilvl w:val="0"/>
-          <w:numId w:val="3"/>
+          <w:numId w:val="2"/>
         </w:numPr>
         <w:rPr/>
       </w:pPr>
-      <w:hyperlink r:id="rId6">
-        <w:r>
-          <w:rPr>
-            <w:rStyle w:val="Hyperlink"/>
-          </w:rPr>
-          <w:t>https://qdrant.tech/documentation/concepts/vectors/</w:t>
-        </w:r>
-      </w:hyperlink>
+      <w:r>
+        <w:rPr>
+          <w:rStyle w:val="Hyperlink"/>
+        </w:rPr>
+        <w:t>https://qdrant.tech/documentation/concepts/vectors/</w:t>
+      </w:r>
     </w:p>
     <w:p>
       <w:pPr>
         <w:pStyle w:val="fastcamp"/>
         <w:numPr>
           <w:ilvl w:val="0"/>
-          <w:numId w:val="3"/>
+          <w:numId w:val="2"/>
         </w:numPr>
         <w:rPr/>
       </w:pPr>
-      <w:hyperlink r:id="rId8">
-        <w:r>
-          <w:rPr>
-            <w:rStyle w:val="Hyperlink"/>
-          </w:rPr>
-          <w:t>https://qdrant.tech/documentation/concepts/search/</w:t>
-        </w:r>
-      </w:hyperlink>
+      <w:r>
+        <w:rPr>
+          <w:rStyle w:val="Hyperlink"/>
+        </w:rPr>
+        <w:t>https://qdrant.tech/documentation/concepts/search/</w:t>
+      </w:r>
     </w:p>
     <w:p>
       <w:pPr>
         <w:pStyle w:val="fastcamp"/>
         <w:numPr>
           <w:ilvl w:val="0"/>
-          <w:numId w:val="3"/>
+          <w:numId w:val="2"/>
         </w:numPr>
         <w:rPr/>
       </w:pPr>
-      <w:hyperlink r:id="rId10">
-        <w:r>
-          <w:rPr>
-            <w:rStyle w:val="Hyperlink"/>
-          </w:rPr>
-          <w:t>https://medium.com/@fr4nk/qdrant-create-collection-api-deep-dive-engineering-high-performance-vector-collections-fab57e6285a0</w:t>
-        </w:r>
-      </w:hyperlink>
+      <w:r>
+        <w:rPr>
+          <w:rStyle w:val="Hyperlink"/>
+        </w:rPr>
+        <w:t>https://medium.com/@fr4nk/qdrant-create-collection-api-deep-dive-engineering-high-performance-vector-collections-fab57e6285a0</w:t>
+      </w:r>
     </w:p>
     <w:p>
       <w:pPr>
         <w:pStyle w:val="fastcamp"/>
         <w:numPr>
           <w:ilvl w:val="0"/>
-          <w:numId w:val="3"/>
+          <w:numId w:val="2"/>
         </w:numPr>
         <w:rPr/>
       </w:pPr>
-      <w:hyperlink r:id="rId12">
-        <w:r>
-          <w:rPr>
-            <w:rStyle w:val="Hyperlink"/>
-          </w:rPr>
-          <w:t>https://towardsdatascience.com/multimodal-embeddings-an-introduction-5dc36975966f/</w:t>
-        </w:r>
-      </w:hyperlink>
+      <w:r>
+        <w:rPr>
+          <w:rStyle w:val="Hyperlink"/>
+        </w:rPr>
+        <w:t>https://towardsdatascience.com/multimodal-embeddings-an-introduction-5dc36975966f/</w:t>
+      </w:r>
     </w:p>
     <w:p>
       <w:pPr>
         <w:pStyle w:val="fastcamp"/>
         <w:numPr>
           <w:ilvl w:val="0"/>
-          <w:numId w:val="3"/>
+          <w:numId w:val="2"/>
         </w:numPr>
         <w:spacing w:before="0" w:after="160"/>
         <w:rPr/>
@@ -404,6 +386,280 @@
   <w:abstractNum w:abstractNumId="1">
     <w:lvl w:ilvl="0">
       <w:start w:val="1"/>
+      <w:numFmt w:val="bullet"/>
+      <w:lvlText w:val=""/>
+      <w:lvlJc w:val="left"/>
+      <w:pPr>
+        <w:tabs>
+          <w:tab w:val="num" w:pos="720"/>
+        </w:tabs>
+        <w:ind w:left="720" w:hanging="360"/>
+      </w:pPr>
+      <w:rPr>
+        <w:rFonts w:ascii="Symbol" w:hAnsi="Symbol" w:cs="Symbol" w:hint="default"/>
+      </w:rPr>
+    </w:lvl>
+    <w:lvl w:ilvl="1">
+      <w:start w:val="1"/>
+      <w:numFmt w:val="bullet"/>
+      <w:lvlText w:val="◦"/>
+      <w:lvlJc w:val="left"/>
+      <w:pPr>
+        <w:tabs>
+          <w:tab w:val="num" w:pos="1080"/>
+        </w:tabs>
+        <w:ind w:left="1080" w:hanging="360"/>
+      </w:pPr>
+      <w:rPr>
+        <w:rFonts w:ascii="OpenSymbol" w:hAnsi="OpenSymbol" w:cs="OpenSymbol" w:hint="default"/>
+      </w:rPr>
+    </w:lvl>
+    <w:lvl w:ilvl="2">
+      <w:start w:val="1"/>
+      <w:numFmt w:val="bullet"/>
+      <w:lvlText w:val="▪"/>
+      <w:lvlJc w:val="left"/>
+      <w:pPr>
+        <w:tabs>
+          <w:tab w:val="num" w:pos="1440"/>
+        </w:tabs>
+        <w:ind w:left="1440" w:hanging="360"/>
+      </w:pPr>
+      <w:rPr>
+        <w:rFonts w:ascii="OpenSymbol" w:hAnsi="OpenSymbol" w:cs="OpenSymbol" w:hint="default"/>
+      </w:rPr>
+    </w:lvl>
+    <w:lvl w:ilvl="3">
+      <w:start w:val="1"/>
+      <w:numFmt w:val="bullet"/>
+      <w:lvlText w:val=""/>
+      <w:lvlJc w:val="left"/>
+      <w:pPr>
+        <w:tabs>
+          <w:tab w:val="num" w:pos="1800"/>
+        </w:tabs>
+        <w:ind w:left="1800" w:hanging="360"/>
+      </w:pPr>
+      <w:rPr>
+        <w:rFonts w:ascii="Symbol" w:hAnsi="Symbol" w:cs="Symbol" w:hint="default"/>
+      </w:rPr>
+    </w:lvl>
+    <w:lvl w:ilvl="4">
+      <w:start w:val="1"/>
+      <w:numFmt w:val="bullet"/>
+      <w:lvlText w:val="◦"/>
+      <w:lvlJc w:val="left"/>
+      <w:pPr>
+        <w:tabs>
+          <w:tab w:val="num" w:pos="2160"/>
+        </w:tabs>
+        <w:ind w:left="2160" w:hanging="360"/>
+      </w:pPr>
+      <w:rPr>
+        <w:rFonts w:ascii="OpenSymbol" w:hAnsi="OpenSymbol" w:cs="OpenSymbol" w:hint="default"/>
+      </w:rPr>
+    </w:lvl>
+    <w:lvl w:ilvl="5">
+      <w:start w:val="1"/>
+      <w:numFmt w:val="bullet"/>
+      <w:lvlText w:val="▪"/>
+      <w:lvlJc w:val="left"/>
+      <w:pPr>
+        <w:tabs>
+          <w:tab w:val="num" w:pos="2520"/>
+        </w:tabs>
+        <w:ind w:left="2520" w:hanging="360"/>
+      </w:pPr>
+      <w:rPr>
+        <w:rFonts w:ascii="OpenSymbol" w:hAnsi="OpenSymbol" w:cs="OpenSymbol" w:hint="default"/>
+      </w:rPr>
+    </w:lvl>
+    <w:lvl w:ilvl="6">
+      <w:start w:val="1"/>
+      <w:numFmt w:val="bullet"/>
+      <w:lvlText w:val=""/>
+      <w:lvlJc w:val="left"/>
+      <w:pPr>
+        <w:tabs>
+          <w:tab w:val="num" w:pos="2880"/>
+        </w:tabs>
+        <w:ind w:left="2880" w:hanging="360"/>
+      </w:pPr>
+      <w:rPr>
+        <w:rFonts w:ascii="Symbol" w:hAnsi="Symbol" w:cs="Symbol" w:hint="default"/>
+      </w:rPr>
+    </w:lvl>
+    <w:lvl w:ilvl="7">
+      <w:start w:val="1"/>
+      <w:numFmt w:val="bullet"/>
+      <w:lvlText w:val="◦"/>
+      <w:lvlJc w:val="left"/>
+      <w:pPr>
+        <w:tabs>
+          <w:tab w:val="num" w:pos="3240"/>
+        </w:tabs>
+        <w:ind w:left="3240" w:hanging="360"/>
+      </w:pPr>
+      <w:rPr>
+        <w:rFonts w:ascii="OpenSymbol" w:hAnsi="OpenSymbol" w:cs="OpenSymbol" w:hint="default"/>
+      </w:rPr>
+    </w:lvl>
+    <w:lvl w:ilvl="8">
+      <w:start w:val="1"/>
+      <w:numFmt w:val="bullet"/>
+      <w:lvlText w:val="▪"/>
+      <w:lvlJc w:val="left"/>
+      <w:pPr>
+        <w:tabs>
+          <w:tab w:val="num" w:pos="3600"/>
+        </w:tabs>
+        <w:ind w:left="3600" w:hanging="360"/>
+      </w:pPr>
+      <w:rPr>
+        <w:rFonts w:ascii="OpenSymbol" w:hAnsi="OpenSymbol" w:cs="OpenSymbol" w:hint="default"/>
+      </w:rPr>
+    </w:lvl>
+  </w:abstractNum>
+  <w:abstractNum w:abstractNumId="2">
+    <w:lvl w:ilvl="0">
+      <w:start w:val="1"/>
+      <w:numFmt w:val="bullet"/>
+      <w:lvlText w:val=""/>
+      <w:lvlJc w:val="left"/>
+      <w:pPr>
+        <w:tabs>
+          <w:tab w:val="num" w:pos="720"/>
+        </w:tabs>
+        <w:ind w:left="720" w:hanging="360"/>
+      </w:pPr>
+      <w:rPr>
+        <w:rFonts w:ascii="Symbol" w:hAnsi="Symbol" w:cs="Symbol" w:hint="default"/>
+      </w:rPr>
+    </w:lvl>
+    <w:lvl w:ilvl="1">
+      <w:start w:val="1"/>
+      <w:numFmt w:val="bullet"/>
+      <w:lvlText w:val="◦"/>
+      <w:lvlJc w:val="left"/>
+      <w:pPr>
+        <w:tabs>
+          <w:tab w:val="num" w:pos="1080"/>
+        </w:tabs>
+        <w:ind w:left="1080" w:hanging="360"/>
+      </w:pPr>
+      <w:rPr>
+        <w:rFonts w:ascii="OpenSymbol" w:hAnsi="OpenSymbol" w:cs="OpenSymbol" w:hint="default"/>
+      </w:rPr>
+    </w:lvl>
+    <w:lvl w:ilvl="2">
+      <w:start w:val="1"/>
+      <w:numFmt w:val="bullet"/>
+      <w:lvlText w:val="▪"/>
+      <w:lvlJc w:val="left"/>
+      <w:pPr>
+        <w:tabs>
+          <w:tab w:val="num" w:pos="1440"/>
+        </w:tabs>
+        <w:ind w:left="1440" w:hanging="360"/>
+      </w:pPr>
+      <w:rPr>
+        <w:rFonts w:ascii="OpenSymbol" w:hAnsi="OpenSymbol" w:cs="OpenSymbol" w:hint="default"/>
+      </w:rPr>
+    </w:lvl>
+    <w:lvl w:ilvl="3">
+      <w:start w:val="1"/>
+      <w:numFmt w:val="bullet"/>
+      <w:lvlText w:val=""/>
+      <w:lvlJc w:val="left"/>
+      <w:pPr>
+        <w:tabs>
+          <w:tab w:val="num" w:pos="1800"/>
+        </w:tabs>
+        <w:ind w:left="1800" w:hanging="360"/>
+      </w:pPr>
+      <w:rPr>
+        <w:rFonts w:ascii="Symbol" w:hAnsi="Symbol" w:cs="Symbol" w:hint="default"/>
+      </w:rPr>
+    </w:lvl>
+    <w:lvl w:ilvl="4">
+      <w:start w:val="1"/>
+      <w:numFmt w:val="bullet"/>
+      <w:lvlText w:val="◦"/>
+      <w:lvlJc w:val="left"/>
+      <w:pPr>
+        <w:tabs>
+          <w:tab w:val="num" w:pos="2160"/>
+        </w:tabs>
+        <w:ind w:left="2160" w:hanging="360"/>
+      </w:pPr>
+      <w:rPr>
+        <w:rFonts w:ascii="OpenSymbol" w:hAnsi="OpenSymbol" w:cs="OpenSymbol" w:hint="default"/>
+      </w:rPr>
+    </w:lvl>
+    <w:lvl w:ilvl="5">
+      <w:start w:val="1"/>
+      <w:numFmt w:val="bullet"/>
+      <w:lvlText w:val="▪"/>
+      <w:lvlJc w:val="left"/>
+      <w:pPr>
+        <w:tabs>
+          <w:tab w:val="num" w:pos="2520"/>
+        </w:tabs>
+        <w:ind w:left="2520" w:hanging="360"/>
+      </w:pPr>
+      <w:rPr>
+        <w:rFonts w:ascii="OpenSymbol" w:hAnsi="OpenSymbol" w:cs="OpenSymbol" w:hint="default"/>
+      </w:rPr>
+    </w:lvl>
+    <w:lvl w:ilvl="6">
+      <w:start w:val="1"/>
+      <w:numFmt w:val="bullet"/>
+      <w:lvlText w:val=""/>
+      <w:lvlJc w:val="left"/>
+      <w:pPr>
+        <w:tabs>
+          <w:tab w:val="num" w:pos="2880"/>
+        </w:tabs>
+        <w:ind w:left="2880" w:hanging="360"/>
+      </w:pPr>
+      <w:rPr>
+        <w:rFonts w:ascii="Symbol" w:hAnsi="Symbol" w:cs="Symbol" w:hint="default"/>
+      </w:rPr>
+    </w:lvl>
+    <w:lvl w:ilvl="7">
+      <w:start w:val="1"/>
+      <w:numFmt w:val="bullet"/>
+      <w:lvlText w:val="◦"/>
+      <w:lvlJc w:val="left"/>
+      <w:pPr>
+        <w:tabs>
+          <w:tab w:val="num" w:pos="3240"/>
+        </w:tabs>
+        <w:ind w:left="3240" w:hanging="360"/>
+      </w:pPr>
+      <w:rPr>
+        <w:rFonts w:ascii="OpenSymbol" w:hAnsi="OpenSymbol" w:cs="OpenSymbol" w:hint="default"/>
+      </w:rPr>
+    </w:lvl>
+    <w:lvl w:ilvl="8">
+      <w:start w:val="1"/>
+      <w:numFmt w:val="bullet"/>
+      <w:lvlText w:val="▪"/>
+      <w:lvlJc w:val="left"/>
+      <w:pPr>
+        <w:tabs>
+          <w:tab w:val="num" w:pos="3600"/>
+        </w:tabs>
+        <w:ind w:left="3600" w:hanging="360"/>
+      </w:pPr>
+      <w:rPr>
+        <w:rFonts w:ascii="OpenSymbol" w:hAnsi="OpenSymbol" w:cs="OpenSymbol" w:hint="default"/>
+      </w:rPr>
+    </w:lvl>
+  </w:abstractNum>
+  <w:abstractNum w:abstractNumId="3">
+    <w:lvl w:ilvl="0">
+      <w:start w:val="1"/>
       <w:numFmt w:val="none"/>
       <w:suff w:val="nothing"/>
       <w:lvlText w:val=""/>
@@ -518,280 +774,6 @@
         </w:tabs>
         <w:ind w:left="0" w:hanging="0"/>
       </w:pPr>
-    </w:lvl>
-  </w:abstractNum>
-  <w:abstractNum w:abstractNumId="2">
-    <w:lvl w:ilvl="0">
-      <w:start w:val="1"/>
-      <w:numFmt w:val="bullet"/>
-      <w:lvlText w:val=""/>
-      <w:lvlJc w:val="left"/>
-      <w:pPr>
-        <w:tabs>
-          <w:tab w:val="num" w:pos="720"/>
-        </w:tabs>
-        <w:ind w:left="720" w:hanging="360"/>
-      </w:pPr>
-      <w:rPr>
-        <w:rFonts w:ascii="Symbol" w:hAnsi="Symbol" w:cs="Symbol" w:hint="default"/>
-      </w:rPr>
-    </w:lvl>
-    <w:lvl w:ilvl="1">
-      <w:start w:val="1"/>
-      <w:numFmt w:val="bullet"/>
-      <w:lvlText w:val="◦"/>
-      <w:lvlJc w:val="left"/>
-      <w:pPr>
-        <w:tabs>
-          <w:tab w:val="num" w:pos="1080"/>
-        </w:tabs>
-        <w:ind w:left="1080" w:hanging="360"/>
-      </w:pPr>
-      <w:rPr>
-        <w:rFonts w:ascii="OpenSymbol" w:hAnsi="OpenSymbol" w:cs="OpenSymbol" w:hint="default"/>
-      </w:rPr>
-    </w:lvl>
-    <w:lvl w:ilvl="2">
-      <w:start w:val="1"/>
-      <w:numFmt w:val="bullet"/>
-      <w:lvlText w:val="▪"/>
-      <w:lvlJc w:val="left"/>
-      <w:pPr>
-        <w:tabs>
-          <w:tab w:val="num" w:pos="1440"/>
-        </w:tabs>
-        <w:ind w:left="1440" w:hanging="360"/>
-      </w:pPr>
-      <w:rPr>
-        <w:rFonts w:ascii="OpenSymbol" w:hAnsi="OpenSymbol" w:cs="OpenSymbol" w:hint="default"/>
-      </w:rPr>
-    </w:lvl>
-    <w:lvl w:ilvl="3">
-      <w:start w:val="1"/>
-      <w:numFmt w:val="bullet"/>
-      <w:lvlText w:val=""/>
-      <w:lvlJc w:val="left"/>
-      <w:pPr>
-        <w:tabs>
-          <w:tab w:val="num" w:pos="1800"/>
-        </w:tabs>
-        <w:ind w:left="1800" w:hanging="360"/>
-      </w:pPr>
-      <w:rPr>
-        <w:rFonts w:ascii="Symbol" w:hAnsi="Symbol" w:cs="Symbol" w:hint="default"/>
-      </w:rPr>
-    </w:lvl>
-    <w:lvl w:ilvl="4">
-      <w:start w:val="1"/>
-      <w:numFmt w:val="bullet"/>
-      <w:lvlText w:val="◦"/>
-      <w:lvlJc w:val="left"/>
-      <w:pPr>
-        <w:tabs>
-          <w:tab w:val="num" w:pos="2160"/>
-        </w:tabs>
-        <w:ind w:left="2160" w:hanging="360"/>
-      </w:pPr>
-      <w:rPr>
-        <w:rFonts w:ascii="OpenSymbol" w:hAnsi="OpenSymbol" w:cs="OpenSymbol" w:hint="default"/>
-      </w:rPr>
-    </w:lvl>
-    <w:lvl w:ilvl="5">
-      <w:start w:val="1"/>
-      <w:numFmt w:val="bullet"/>
-      <w:lvlText w:val="▪"/>
-      <w:lvlJc w:val="left"/>
-      <w:pPr>
-        <w:tabs>
-          <w:tab w:val="num" w:pos="2520"/>
-        </w:tabs>
-        <w:ind w:left="2520" w:hanging="360"/>
-      </w:pPr>
-      <w:rPr>
-        <w:rFonts w:ascii="OpenSymbol" w:hAnsi="OpenSymbol" w:cs="OpenSymbol" w:hint="default"/>
-      </w:rPr>
-    </w:lvl>
-    <w:lvl w:ilvl="6">
-      <w:start w:val="1"/>
-      <w:numFmt w:val="bullet"/>
-      <w:lvlText w:val=""/>
-      <w:lvlJc w:val="left"/>
-      <w:pPr>
-        <w:tabs>
-          <w:tab w:val="num" w:pos="2880"/>
-        </w:tabs>
-        <w:ind w:left="2880" w:hanging="360"/>
-      </w:pPr>
-      <w:rPr>
-        <w:rFonts w:ascii="Symbol" w:hAnsi="Symbol" w:cs="Symbol" w:hint="default"/>
-      </w:rPr>
-    </w:lvl>
-    <w:lvl w:ilvl="7">
-      <w:start w:val="1"/>
-      <w:numFmt w:val="bullet"/>
-      <w:lvlText w:val="◦"/>
-      <w:lvlJc w:val="left"/>
-      <w:pPr>
-        <w:tabs>
-          <w:tab w:val="num" w:pos="3240"/>
-        </w:tabs>
-        <w:ind w:left="3240" w:hanging="360"/>
-      </w:pPr>
-      <w:rPr>
-        <w:rFonts w:ascii="OpenSymbol" w:hAnsi="OpenSymbol" w:cs="OpenSymbol" w:hint="default"/>
-      </w:rPr>
-    </w:lvl>
-    <w:lvl w:ilvl="8">
-      <w:start w:val="1"/>
-      <w:numFmt w:val="bullet"/>
-      <w:lvlText w:val="▪"/>
-      <w:lvlJc w:val="left"/>
-      <w:pPr>
-        <w:tabs>
-          <w:tab w:val="num" w:pos="3600"/>
-        </w:tabs>
-        <w:ind w:left="3600" w:hanging="360"/>
-      </w:pPr>
-      <w:rPr>
-        <w:rFonts w:ascii="OpenSymbol" w:hAnsi="OpenSymbol" w:cs="OpenSymbol" w:hint="default"/>
-      </w:rPr>
-    </w:lvl>
-  </w:abstractNum>
-  <w:abstractNum w:abstractNumId="3">
-    <w:lvl w:ilvl="0">
-      <w:start w:val="1"/>
-      <w:numFmt w:val="bullet"/>
-      <w:lvlText w:val=""/>
-      <w:lvlJc w:val="left"/>
-      <w:pPr>
-        <w:tabs>
-          <w:tab w:val="num" w:pos="720"/>
-        </w:tabs>
-        <w:ind w:left="720" w:hanging="360"/>
-      </w:pPr>
-      <w:rPr>
-        <w:rFonts w:ascii="Symbol" w:hAnsi="Symbol" w:cs="Symbol" w:hint="default"/>
-      </w:rPr>
-    </w:lvl>
-    <w:lvl w:ilvl="1">
-      <w:start w:val="1"/>
-      <w:numFmt w:val="bullet"/>
-      <w:lvlText w:val="◦"/>
-      <w:lvlJc w:val="left"/>
-      <w:pPr>
-        <w:tabs>
-          <w:tab w:val="num" w:pos="1080"/>
-        </w:tabs>
-        <w:ind w:left="1080" w:hanging="360"/>
-      </w:pPr>
-      <w:rPr>
-        <w:rFonts w:ascii="OpenSymbol" w:hAnsi="OpenSymbol" w:cs="OpenSymbol" w:hint="default"/>
-      </w:rPr>
-    </w:lvl>
-    <w:lvl w:ilvl="2">
-      <w:start w:val="1"/>
-      <w:numFmt w:val="bullet"/>
-      <w:lvlText w:val="▪"/>
-      <w:lvlJc w:val="left"/>
-      <w:pPr>
-        <w:tabs>
-          <w:tab w:val="num" w:pos="1440"/>
-        </w:tabs>
-        <w:ind w:left="1440" w:hanging="360"/>
-      </w:pPr>
-      <w:rPr>
-        <w:rFonts w:ascii="OpenSymbol" w:hAnsi="OpenSymbol" w:cs="OpenSymbol" w:hint="default"/>
-      </w:rPr>
-    </w:lvl>
-    <w:lvl w:ilvl="3">
-      <w:start w:val="1"/>
-      <w:numFmt w:val="bullet"/>
-      <w:lvlText w:val=""/>
-      <w:lvlJc w:val="left"/>
-      <w:pPr>
-        <w:tabs>
-          <w:tab w:val="num" w:pos="1800"/>
-        </w:tabs>
-        <w:ind w:left="1800" w:hanging="360"/>
-      </w:pPr>
-      <w:rPr>
-        <w:rFonts w:ascii="Symbol" w:hAnsi="Symbol" w:cs="Symbol" w:hint="default"/>
-      </w:rPr>
-    </w:lvl>
-    <w:lvl w:ilvl="4">
-      <w:start w:val="1"/>
-      <w:numFmt w:val="bullet"/>
-      <w:lvlText w:val="◦"/>
-      <w:lvlJc w:val="left"/>
-      <w:pPr>
-        <w:tabs>
-          <w:tab w:val="num" w:pos="2160"/>
-        </w:tabs>
-        <w:ind w:left="2160" w:hanging="360"/>
-      </w:pPr>
-      <w:rPr>
-        <w:rFonts w:ascii="OpenSymbol" w:hAnsi="OpenSymbol" w:cs="OpenSymbol" w:hint="default"/>
-      </w:rPr>
-    </w:lvl>
-    <w:lvl w:ilvl="5">
-      <w:start w:val="1"/>
-      <w:numFmt w:val="bullet"/>
-      <w:lvlText w:val="▪"/>
-      <w:lvlJc w:val="left"/>
-      <w:pPr>
-        <w:tabs>
-          <w:tab w:val="num" w:pos="2520"/>
-        </w:tabs>
-        <w:ind w:left="2520" w:hanging="360"/>
-      </w:pPr>
-      <w:rPr>
-        <w:rFonts w:ascii="OpenSymbol" w:hAnsi="OpenSymbol" w:cs="OpenSymbol" w:hint="default"/>
-      </w:rPr>
-    </w:lvl>
-    <w:lvl w:ilvl="6">
-      <w:start w:val="1"/>
-      <w:numFmt w:val="bullet"/>
-      <w:lvlText w:val=""/>
-      <w:lvlJc w:val="left"/>
-      <w:pPr>
-        <w:tabs>
-          <w:tab w:val="num" w:pos="2880"/>
-        </w:tabs>
-        <w:ind w:left="2880" w:hanging="360"/>
-      </w:pPr>
-      <w:rPr>
-        <w:rFonts w:ascii="Symbol" w:hAnsi="Symbol" w:cs="Symbol" w:hint="default"/>
-      </w:rPr>
-    </w:lvl>
-    <w:lvl w:ilvl="7">
-      <w:start w:val="1"/>
-      <w:numFmt w:val="bullet"/>
-      <w:lvlText w:val="◦"/>
-      <w:lvlJc w:val="left"/>
-      <w:pPr>
-        <w:tabs>
-          <w:tab w:val="num" w:pos="3240"/>
-        </w:tabs>
-        <w:ind w:left="3240" w:hanging="360"/>
-      </w:pPr>
-      <w:rPr>
-        <w:rFonts w:ascii="OpenSymbol" w:hAnsi="OpenSymbol" w:cs="OpenSymbol" w:hint="default"/>
-      </w:rPr>
-    </w:lvl>
-    <w:lvl w:ilvl="8">
-      <w:start w:val="1"/>
-      <w:numFmt w:val="bullet"/>
-      <w:lvlText w:val="▪"/>
-      <w:lvlJc w:val="left"/>
-      <w:pPr>
-        <w:tabs>
-          <w:tab w:val="num" w:pos="3600"/>
-        </w:tabs>
-        <w:ind w:left="3600" w:hanging="360"/>
-      </w:pPr>
-      <w:rPr>
-        <w:rFonts w:ascii="OpenSymbol" w:hAnsi="OpenSymbol" w:cs="OpenSymbol" w:hint="default"/>
-      </w:rPr>
     </w:lvl>
   </w:abstractNum>
   <w:num w:numId="1">

</xml_diff>

<commit_message>
docs: relatorio da entrega 6
</commit_message>
<xml_diff>
--- a/atv06/06-Leonardo_Cortes_Filho.docx
+++ b/atv06/06-Leonardo_Cortes_Filho.docx
@@ -86,7 +86,23 @@
           <w:sz w:val="20"/>
           <w:szCs w:val="20"/>
         </w:rPr>
-        <w:t>A documentação mostrou diretamente como fazer uso de modelos de embedding, modelos focados em converter objetos, ex. Texto, imagens, etc, em vetores númericos com o objetivo de capturar o sentido semântico do objeto. Esse processo resulta em vetores com alto número de dimensões (256+), facilitando buscas contextuais em databases maiores, modelos mais recentes (pelo o que eu pesquisei 2024) conseguem fazer embedding multimodais, podendo converter diferentes tipos de objetos em um mesmo espaço vetorial, facilitando análise semântica para outros modelos.</w:t>
+        <w:t xml:space="preserve">A documentação mostrou diretamente como fazer uso de modelos de embedding, modelos focados em converter objetos, ex. Texto, imagens, etc, em vetores númericos com o objetivo de capturar o sentido semântico do objeto. Esse processo resulta em vetores com alto número de dimensões (256+), facilitando buscas contextuais em databases maiores, modelos mais recentes (pelo o que eu pesquisei </w:t>
+      </w:r>
+      <w:r>
+        <w:rPr>
+          <w:rFonts w:cs="Arial" w:ascii="Arial" w:hAnsi="Arial"/>
+          <w:sz w:val="20"/>
+          <w:szCs w:val="20"/>
+        </w:rPr>
+        <w:t xml:space="preserve">de </w:t>
+      </w:r>
+      <w:r>
+        <w:rPr>
+          <w:rFonts w:cs="Arial" w:ascii="Arial" w:hAnsi="Arial"/>
+          <w:sz w:val="20"/>
+          <w:szCs w:val="20"/>
+        </w:rPr>
+        <w:t>2024) conseguem fazer embedding multimodais, podendo converter diferentes tipos de objetos em um mesmo espaço vetorial, facilitando análise semântica para outros modelos.</w:t>
       </w:r>
     </w:p>
     <w:p>
@@ -94,12 +110,209 @@
         <w:pStyle w:val="Normal"/>
         <w:rPr>
           <w:rFonts w:ascii="Arial" w:hAnsi="Arial" w:cs="Arial"/>
+          <w:sz w:val="20"/>
+          <w:szCs w:val="20"/>
         </w:rPr>
       </w:pPr>
       <w:r>
         <w:rPr>
           <w:rFonts w:cs="Arial" w:ascii="Arial" w:hAnsi="Arial"/>
-        </w:rPr>
+          <w:sz w:val="20"/>
+          <w:szCs w:val="20"/>
+        </w:rPr>
+        <w:t>Funcionamento de embedding:</w:t>
+      </w:r>
+    </w:p>
+    <w:p>
+      <w:pPr>
+        <w:pStyle w:val="Normal"/>
+        <w:rPr>
+          <w:rFonts w:ascii="Arial" w:hAnsi="Arial" w:cs="Arial"/>
+          <w:sz w:val="20"/>
+          <w:szCs w:val="20"/>
+        </w:rPr>
+      </w:pPr>
+      <w:r>
+        <w:rPr>
+          <w:rFonts w:cs="Arial" w:ascii="Arial" w:hAnsi="Arial"/>
+          <w:sz w:val="20"/>
+          <w:szCs w:val="20"/>
+        </w:rPr>
+        <w:t>Para processamento de texto seria feito a fragmentação durante o pré-processamento, mas esse processo não faz sentido para imagens, aúdios e outros formatos não textuais.</w:t>
+      </w:r>
+    </w:p>
+    <w:p>
+      <w:pPr>
+        <w:pStyle w:val="Normal"/>
+        <w:rPr>
+          <w:rFonts w:ascii="Arial" w:hAnsi="Arial" w:cs="Arial"/>
+          <w:sz w:val="20"/>
+          <w:szCs w:val="20"/>
+        </w:rPr>
+      </w:pPr>
+      <w:r>
+        <w:rPr>
+          <w:rFonts w:cs="Arial" w:ascii="Arial" w:hAnsi="Arial"/>
+          <w:sz w:val="20"/>
+          <w:szCs w:val="20"/>
+        </w:rPr>
+        <w:drawing>
+          <wp:anchor distT="0" distB="0" distL="0" distR="0" simplePos="0" relativeHeight="3" behindDoc="0" locked="0" layoutInCell="0" allowOverlap="1">
+            <wp:simplePos x="0" y="0"/>
+            <wp:positionH relativeFrom="column">
+              <wp:align>center</wp:align>
+            </wp:positionH>
+            <wp:positionV relativeFrom="paragraph">
+              <wp:posOffset>635</wp:posOffset>
+            </wp:positionV>
+            <wp:extent cx="5400040" cy="1313815"/>
+            <wp:effectExtent l="0" t="0" r="0" b="0"/>
+            <wp:wrapTopAndBottom/>
+            <wp:docPr id="1" name="Image2"/>
+            <wp:cNvGraphicFramePr>
+              <a:graphicFrameLocks xmlns:a="http://schemas.openxmlformats.org/drawingml/2006/main" noChangeAspect="1"/>
+            </wp:cNvGraphicFramePr>
+            <a:graphic xmlns:a="http://schemas.openxmlformats.org/drawingml/2006/main">
+              <a:graphicData uri="http://schemas.openxmlformats.org/drawingml/2006/picture">
+                <pic:pic xmlns:pic="http://schemas.openxmlformats.org/drawingml/2006/picture">
+                  <pic:nvPicPr>
+                    <pic:cNvPr id="1" name="Image2"/>
+                    <pic:cNvPicPr>
+                      <a:picLocks noChangeAspect="1" noChangeArrowheads="1"/>
+                    </pic:cNvPicPr>
+                  </pic:nvPicPr>
+                  <pic:blipFill>
+                    <a:blip r:embed="rId2"/>
+                    <a:stretch>
+                      <a:fillRect/>
+                    </a:stretch>
+                  </pic:blipFill>
+                  <pic:spPr bwMode="auto">
+                    <a:xfrm>
+                      <a:off x="0" y="0"/>
+                      <a:ext cx="5400040" cy="1313815"/>
+                    </a:xfrm>
+                    <a:prstGeom prst="rect">
+                      <a:avLst/>
+                    </a:prstGeom>
+                    <a:noFill/>
+                  </pic:spPr>
+                </pic:pic>
+              </a:graphicData>
+            </a:graphic>
+          </wp:anchor>
+        </w:drawing>
+      </w:r>
+    </w:p>
+    <w:p>
+      <w:pPr>
+        <w:pStyle w:val="fastcamp"/>
+        <w:rPr/>
+      </w:pPr>
+      <w:r>
+        <w:rPr/>
+        <w:t xml:space="preserve">Já o vídeo, demonstrou como fazer a captura de dados e inseri-los no espaço vetorial, </w:t>
+      </w:r>
+      <w:r>
+        <w:rPr/>
+        <w:t>onde eles são fragmentados e tokenizados</w:t>
+      </w:r>
+      <w:r>
+        <w:rPr/>
+        <w:t xml:space="preserve">, permitindo que modelos usem para contexto </w:t>
+      </w:r>
+      <w:r>
+        <w:rPr/>
+        <w:t>sem a necessidade de busca exata no banco de dados</w:t>
+      </w:r>
+      <w:r>
+        <w:rPr/>
+        <w:t>, o que é exatamente o próximo workflow, em que utilizamos um agente novamente, mas dessa vez o conectamos ao espaço vetorial, o permitindo buscas semânticas, melhorando as respostas via o contexto fornecido via o primeiro workflow.</w:t>
+      </w:r>
+    </w:p>
+    <w:p>
+      <w:pPr>
+        <w:pStyle w:val="fastcamp"/>
+        <w:rPr/>
+      </w:pPr>
+      <w:r>
+        <w:rPr/>
+        <w:t xml:space="preserve">Nessa ideia, seria possível fazer uma RAG dinâmico, em que o agente decide o que pesquisar nessa internet, os resultados web são transferidos para o modelo de embedding e a partir desse momento o agente pode acessar os dados de forma rápida e contextualizada, melhorando suas respostas. </w:t>
+      </w:r>
+    </w:p>
+    <w:p>
+      <w:pPr>
+        <w:pStyle w:val="fastcamp"/>
+        <w:rPr/>
+      </w:pPr>
+      <w:r>
+        <w:rPr/>
+        <w:t>Fluxo de funcionamento:</w:t>
+      </w:r>
+    </w:p>
+    <w:p>
+      <w:pPr>
+        <w:pStyle w:val="fastcamp"/>
+        <w:rPr/>
+      </w:pPr>
+      <w:r>
+        <w:rPr/>
+        <w:t>Mantendo os workflows separados, mas é possível fazer overlap.</w:t>
+      </w:r>
+    </w:p>
+    <w:p>
+      <w:pPr>
+        <w:pStyle w:val="fastcamp"/>
+        <w:rPr/>
+      </w:pPr>
+      <w:r>
+        <w:rPr/>
+        <w:drawing>
+          <wp:anchor distT="0" distB="0" distL="0" distR="0" simplePos="0" relativeHeight="2" behindDoc="0" locked="0" layoutInCell="0" allowOverlap="1">
+            <wp:simplePos x="0" y="0"/>
+            <wp:positionH relativeFrom="column">
+              <wp:align>center</wp:align>
+            </wp:positionH>
+            <wp:positionV relativeFrom="paragraph">
+              <wp:posOffset>635</wp:posOffset>
+            </wp:positionV>
+            <wp:extent cx="5400040" cy="1929765"/>
+            <wp:effectExtent l="0" t="0" r="0" b="0"/>
+            <wp:wrapTopAndBottom/>
+            <wp:docPr id="2" name="Image1"/>
+            <wp:cNvGraphicFramePr>
+              <a:graphicFrameLocks xmlns:a="http://schemas.openxmlformats.org/drawingml/2006/main" noChangeAspect="1"/>
+            </wp:cNvGraphicFramePr>
+            <a:graphic xmlns:a="http://schemas.openxmlformats.org/drawingml/2006/main">
+              <a:graphicData uri="http://schemas.openxmlformats.org/drawingml/2006/picture">
+                <pic:pic xmlns:pic="http://schemas.openxmlformats.org/drawingml/2006/picture">
+                  <pic:nvPicPr>
+                    <pic:cNvPr id="2" name="Image1"/>
+                    <pic:cNvPicPr>
+                      <a:picLocks noChangeAspect="1" noChangeArrowheads="1"/>
+                    </pic:cNvPicPr>
+                  </pic:nvPicPr>
+                  <pic:blipFill>
+                    <a:blip r:embed="rId3"/>
+                    <a:stretch>
+                      <a:fillRect/>
+                    </a:stretch>
+                  </pic:blipFill>
+                  <pic:spPr bwMode="auto">
+                    <a:xfrm>
+                      <a:off x="0" y="0"/>
+                      <a:ext cx="5400040" cy="1929765"/>
+                    </a:xfrm>
+                    <a:prstGeom prst="rect">
+                      <a:avLst/>
+                    </a:prstGeom>
+                    <a:noFill/>
+                  </pic:spPr>
+                </pic:pic>
+              </a:graphicData>
+            </a:graphic>
+          </wp:anchor>
+        </w:drawing>
       </w:r>
     </w:p>
     <w:p>
@@ -180,7 +393,7 @@
       </w:pPr>
       <w:r>
         <w:rPr/>
-        <w:t>&lt;Nesta seção o participante deverá descrever as suas conclusões sobre os temas abordados nas tarefas do card.&gt;</w:t>
+        <w:t>Em conclusão, embedding permite que modelos de linguagem compreendam contextos multimodais, texto, aúdio, imagens, ao colocá-los em um espaço vetorial, também permitindo, graças a sua organização, buscas semânticas ao invés de buscas exatas. Essa arquitetura é altamente modular, permitindo que o modelo acesse muita informação de maneira rápida e confiável, criando a possibilidade de projetos consideravelmente maiores sem grandes sacrificios.</w:t>
       </w:r>
     </w:p>
     <w:p>
@@ -242,7 +455,7 @@
         <w:pStyle w:val="fastcamp"/>
         <w:numPr>
           <w:ilvl w:val="0"/>
-          <w:numId w:val="1"/>
+          <w:numId w:val="2"/>
         </w:numPr>
         <w:rPr/>
       </w:pPr>
@@ -258,11 +471,11 @@
         <w:pStyle w:val="fastcamp"/>
         <w:numPr>
           <w:ilvl w:val="0"/>
-          <w:numId w:val="1"/>
+          <w:numId w:val="2"/>
         </w:numPr>
         <w:rPr/>
       </w:pPr>
-      <w:hyperlink r:id="rId2">
+      <w:hyperlink r:id="rId4">
         <w:r>
           <w:rPr>
             <w:rStyle w:val="Hyperlink"/>
@@ -295,7 +508,7 @@
         <w:pStyle w:val="fastcamp"/>
         <w:numPr>
           <w:ilvl w:val="0"/>
-          <w:numId w:val="2"/>
+          <w:numId w:val="3"/>
         </w:numPr>
         <w:rPr/>
       </w:pPr>
@@ -311,7 +524,7 @@
         <w:pStyle w:val="fastcamp"/>
         <w:numPr>
           <w:ilvl w:val="0"/>
-          <w:numId w:val="2"/>
+          <w:numId w:val="3"/>
         </w:numPr>
         <w:rPr/>
       </w:pPr>
@@ -327,7 +540,7 @@
         <w:pStyle w:val="fastcamp"/>
         <w:numPr>
           <w:ilvl w:val="0"/>
-          <w:numId w:val="2"/>
+          <w:numId w:val="3"/>
         </w:numPr>
         <w:rPr/>
       </w:pPr>
@@ -343,7 +556,7 @@
         <w:pStyle w:val="fastcamp"/>
         <w:numPr>
           <w:ilvl w:val="0"/>
-          <w:numId w:val="2"/>
+          <w:numId w:val="3"/>
         </w:numPr>
         <w:rPr/>
       </w:pPr>
@@ -359,14 +572,19 @@
         <w:pStyle w:val="fastcamp"/>
         <w:numPr>
           <w:ilvl w:val="0"/>
-          <w:numId w:val="2"/>
+          <w:numId w:val="3"/>
         </w:numPr>
         <w:spacing w:before="0" w:after="160"/>
         <w:rPr/>
       </w:pPr>
-      <w:r>
-        <w:rPr/>
-      </w:r>
+      <w:hyperlink r:id="rId5">
+        <w:r>
+          <w:rPr>
+            <w:rStyle w:val="Hyperlink"/>
+          </w:rPr>
+          <w:t>https://aws.amazon.com/what-is/embeddings-in-machine-learning/</w:t>
+        </w:r>
+      </w:hyperlink>
     </w:p>
     <w:sectPr>
       <w:type w:val="nextPage"/>
@@ -386,138 +604,120 @@
   <w:abstractNum w:abstractNumId="1">
     <w:lvl w:ilvl="0">
       <w:start w:val="1"/>
-      <w:numFmt w:val="bullet"/>
-      <w:lvlText w:val=""/>
-      <w:lvlJc w:val="left"/>
-      <w:pPr>
-        <w:tabs>
-          <w:tab w:val="num" w:pos="720"/>
-        </w:tabs>
-        <w:ind w:left="720" w:hanging="360"/>
-      </w:pPr>
-      <w:rPr>
-        <w:rFonts w:ascii="Symbol" w:hAnsi="Symbol" w:cs="Symbol" w:hint="default"/>
-      </w:rPr>
+      <w:numFmt w:val="none"/>
+      <w:suff w:val="nothing"/>
+      <w:lvlText w:val=""/>
+      <w:lvlJc w:val="left"/>
+      <w:pPr>
+        <w:tabs>
+          <w:tab w:val="num" w:pos="0"/>
+        </w:tabs>
+        <w:ind w:left="0" w:hanging="0"/>
+      </w:pPr>
     </w:lvl>
     <w:lvl w:ilvl="1">
       <w:start w:val="1"/>
-      <w:numFmt w:val="bullet"/>
-      <w:lvlText w:val="◦"/>
-      <w:lvlJc w:val="left"/>
-      <w:pPr>
-        <w:tabs>
-          <w:tab w:val="num" w:pos="1080"/>
-        </w:tabs>
-        <w:ind w:left="1080" w:hanging="360"/>
-      </w:pPr>
-      <w:rPr>
-        <w:rFonts w:ascii="OpenSymbol" w:hAnsi="OpenSymbol" w:cs="OpenSymbol" w:hint="default"/>
-      </w:rPr>
+      <w:numFmt w:val="none"/>
+      <w:suff w:val="nothing"/>
+      <w:lvlText w:val=""/>
+      <w:lvlJc w:val="left"/>
+      <w:pPr>
+        <w:tabs>
+          <w:tab w:val="num" w:pos="0"/>
+        </w:tabs>
+        <w:ind w:left="0" w:hanging="0"/>
+      </w:pPr>
     </w:lvl>
     <w:lvl w:ilvl="2">
       <w:start w:val="1"/>
-      <w:numFmt w:val="bullet"/>
-      <w:lvlText w:val="▪"/>
-      <w:lvlJc w:val="left"/>
-      <w:pPr>
-        <w:tabs>
-          <w:tab w:val="num" w:pos="1440"/>
-        </w:tabs>
-        <w:ind w:left="1440" w:hanging="360"/>
-      </w:pPr>
-      <w:rPr>
-        <w:rFonts w:ascii="OpenSymbol" w:hAnsi="OpenSymbol" w:cs="OpenSymbol" w:hint="default"/>
-      </w:rPr>
+      <w:numFmt w:val="none"/>
+      <w:suff w:val="nothing"/>
+      <w:lvlText w:val=""/>
+      <w:lvlJc w:val="left"/>
+      <w:pPr>
+        <w:tabs>
+          <w:tab w:val="num" w:pos="0"/>
+        </w:tabs>
+        <w:ind w:left="0" w:hanging="0"/>
+      </w:pPr>
     </w:lvl>
     <w:lvl w:ilvl="3">
       <w:start w:val="1"/>
-      <w:numFmt w:val="bullet"/>
-      <w:lvlText w:val=""/>
-      <w:lvlJc w:val="left"/>
-      <w:pPr>
-        <w:tabs>
-          <w:tab w:val="num" w:pos="1800"/>
-        </w:tabs>
-        <w:ind w:left="1800" w:hanging="360"/>
-      </w:pPr>
-      <w:rPr>
-        <w:rFonts w:ascii="Symbol" w:hAnsi="Symbol" w:cs="Symbol" w:hint="default"/>
-      </w:rPr>
+      <w:numFmt w:val="none"/>
+      <w:suff w:val="nothing"/>
+      <w:lvlText w:val=""/>
+      <w:lvlJc w:val="left"/>
+      <w:pPr>
+        <w:tabs>
+          <w:tab w:val="num" w:pos="0"/>
+        </w:tabs>
+        <w:ind w:left="0" w:hanging="0"/>
+      </w:pPr>
     </w:lvl>
     <w:lvl w:ilvl="4">
       <w:start w:val="1"/>
-      <w:numFmt w:val="bullet"/>
-      <w:lvlText w:val="◦"/>
-      <w:lvlJc w:val="left"/>
-      <w:pPr>
-        <w:tabs>
-          <w:tab w:val="num" w:pos="2160"/>
-        </w:tabs>
-        <w:ind w:left="2160" w:hanging="360"/>
-      </w:pPr>
-      <w:rPr>
-        <w:rFonts w:ascii="OpenSymbol" w:hAnsi="OpenSymbol" w:cs="OpenSymbol" w:hint="default"/>
-      </w:rPr>
+      <w:numFmt w:val="none"/>
+      <w:suff w:val="nothing"/>
+      <w:lvlText w:val=""/>
+      <w:lvlJc w:val="left"/>
+      <w:pPr>
+        <w:tabs>
+          <w:tab w:val="num" w:pos="0"/>
+        </w:tabs>
+        <w:ind w:left="0" w:hanging="0"/>
+      </w:pPr>
     </w:lvl>
     <w:lvl w:ilvl="5">
       <w:start w:val="1"/>
-      <w:numFmt w:val="bullet"/>
-      <w:lvlText w:val="▪"/>
-      <w:lvlJc w:val="left"/>
-      <w:pPr>
-        <w:tabs>
-          <w:tab w:val="num" w:pos="2520"/>
-        </w:tabs>
-        <w:ind w:left="2520" w:hanging="360"/>
-      </w:pPr>
-      <w:rPr>
-        <w:rFonts w:ascii="OpenSymbol" w:hAnsi="OpenSymbol" w:cs="OpenSymbol" w:hint="default"/>
-      </w:rPr>
+      <w:numFmt w:val="none"/>
+      <w:suff w:val="nothing"/>
+      <w:lvlText w:val=""/>
+      <w:lvlJc w:val="left"/>
+      <w:pPr>
+        <w:tabs>
+          <w:tab w:val="num" w:pos="0"/>
+        </w:tabs>
+        <w:ind w:left="0" w:hanging="0"/>
+      </w:pPr>
     </w:lvl>
     <w:lvl w:ilvl="6">
       <w:start w:val="1"/>
-      <w:numFmt w:val="bullet"/>
-      <w:lvlText w:val=""/>
-      <w:lvlJc w:val="left"/>
-      <w:pPr>
-        <w:tabs>
-          <w:tab w:val="num" w:pos="2880"/>
-        </w:tabs>
-        <w:ind w:left="2880" w:hanging="360"/>
-      </w:pPr>
-      <w:rPr>
-        <w:rFonts w:ascii="Symbol" w:hAnsi="Symbol" w:cs="Symbol" w:hint="default"/>
-      </w:rPr>
+      <w:numFmt w:val="none"/>
+      <w:suff w:val="nothing"/>
+      <w:lvlText w:val=""/>
+      <w:lvlJc w:val="left"/>
+      <w:pPr>
+        <w:tabs>
+          <w:tab w:val="num" w:pos="0"/>
+        </w:tabs>
+        <w:ind w:left="0" w:hanging="0"/>
+      </w:pPr>
     </w:lvl>
     <w:lvl w:ilvl="7">
       <w:start w:val="1"/>
-      <w:numFmt w:val="bullet"/>
-      <w:lvlText w:val="◦"/>
-      <w:lvlJc w:val="left"/>
-      <w:pPr>
-        <w:tabs>
-          <w:tab w:val="num" w:pos="3240"/>
-        </w:tabs>
-        <w:ind w:left="3240" w:hanging="360"/>
-      </w:pPr>
-      <w:rPr>
-        <w:rFonts w:ascii="OpenSymbol" w:hAnsi="OpenSymbol" w:cs="OpenSymbol" w:hint="default"/>
-      </w:rPr>
+      <w:numFmt w:val="none"/>
+      <w:suff w:val="nothing"/>
+      <w:lvlText w:val=""/>
+      <w:lvlJc w:val="left"/>
+      <w:pPr>
+        <w:tabs>
+          <w:tab w:val="num" w:pos="0"/>
+        </w:tabs>
+        <w:ind w:left="0" w:hanging="0"/>
+      </w:pPr>
     </w:lvl>
     <w:lvl w:ilvl="8">
       <w:start w:val="1"/>
-      <w:numFmt w:val="bullet"/>
-      <w:lvlText w:val="▪"/>
-      <w:lvlJc w:val="left"/>
-      <w:pPr>
-        <w:tabs>
-          <w:tab w:val="num" w:pos="3600"/>
-        </w:tabs>
-        <w:ind w:left="3600" w:hanging="360"/>
-      </w:pPr>
-      <w:rPr>
-        <w:rFonts w:ascii="OpenSymbol" w:hAnsi="OpenSymbol" w:cs="OpenSymbol" w:hint="default"/>
-      </w:rPr>
+      <w:numFmt w:val="none"/>
+      <w:suff w:val="nothing"/>
+      <w:lvlText w:val=""/>
+      <w:lvlJc w:val="left"/>
+      <w:pPr>
+        <w:tabs>
+          <w:tab w:val="num" w:pos="0"/>
+        </w:tabs>
+        <w:ind w:left="0" w:hanging="0"/>
+      </w:pPr>
     </w:lvl>
   </w:abstractNum>
   <w:abstractNum w:abstractNumId="2">
@@ -660,120 +860,138 @@
   <w:abstractNum w:abstractNumId="3">
     <w:lvl w:ilvl="0">
       <w:start w:val="1"/>
-      <w:numFmt w:val="none"/>
-      <w:suff w:val="nothing"/>
-      <w:lvlText w:val=""/>
-      <w:lvlJc w:val="left"/>
-      <w:pPr>
-        <w:tabs>
-          <w:tab w:val="num" w:pos="0"/>
-        </w:tabs>
-        <w:ind w:left="0" w:hanging="0"/>
-      </w:pPr>
+      <w:numFmt w:val="bullet"/>
+      <w:lvlText w:val=""/>
+      <w:lvlJc w:val="left"/>
+      <w:pPr>
+        <w:tabs>
+          <w:tab w:val="num" w:pos="720"/>
+        </w:tabs>
+        <w:ind w:left="720" w:hanging="360"/>
+      </w:pPr>
+      <w:rPr>
+        <w:rFonts w:ascii="Symbol" w:hAnsi="Symbol" w:cs="Symbol" w:hint="default"/>
+      </w:rPr>
     </w:lvl>
     <w:lvl w:ilvl="1">
       <w:start w:val="1"/>
-      <w:numFmt w:val="none"/>
-      <w:suff w:val="nothing"/>
-      <w:lvlText w:val=""/>
-      <w:lvlJc w:val="left"/>
-      <w:pPr>
-        <w:tabs>
-          <w:tab w:val="num" w:pos="0"/>
-        </w:tabs>
-        <w:ind w:left="0" w:hanging="0"/>
-      </w:pPr>
+      <w:numFmt w:val="bullet"/>
+      <w:lvlText w:val="◦"/>
+      <w:lvlJc w:val="left"/>
+      <w:pPr>
+        <w:tabs>
+          <w:tab w:val="num" w:pos="1080"/>
+        </w:tabs>
+        <w:ind w:left="1080" w:hanging="360"/>
+      </w:pPr>
+      <w:rPr>
+        <w:rFonts w:ascii="OpenSymbol" w:hAnsi="OpenSymbol" w:cs="OpenSymbol" w:hint="default"/>
+      </w:rPr>
     </w:lvl>
     <w:lvl w:ilvl="2">
       <w:start w:val="1"/>
-      <w:numFmt w:val="none"/>
-      <w:suff w:val="nothing"/>
-      <w:lvlText w:val=""/>
-      <w:lvlJc w:val="left"/>
-      <w:pPr>
-        <w:tabs>
-          <w:tab w:val="num" w:pos="0"/>
-        </w:tabs>
-        <w:ind w:left="0" w:hanging="0"/>
-      </w:pPr>
+      <w:numFmt w:val="bullet"/>
+      <w:lvlText w:val="▪"/>
+      <w:lvlJc w:val="left"/>
+      <w:pPr>
+        <w:tabs>
+          <w:tab w:val="num" w:pos="1440"/>
+        </w:tabs>
+        <w:ind w:left="1440" w:hanging="360"/>
+      </w:pPr>
+      <w:rPr>
+        <w:rFonts w:ascii="OpenSymbol" w:hAnsi="OpenSymbol" w:cs="OpenSymbol" w:hint="default"/>
+      </w:rPr>
     </w:lvl>
     <w:lvl w:ilvl="3">
       <w:start w:val="1"/>
-      <w:numFmt w:val="none"/>
-      <w:suff w:val="nothing"/>
-      <w:lvlText w:val=""/>
-      <w:lvlJc w:val="left"/>
-      <w:pPr>
-        <w:tabs>
-          <w:tab w:val="num" w:pos="0"/>
-        </w:tabs>
-        <w:ind w:left="0" w:hanging="0"/>
-      </w:pPr>
+      <w:numFmt w:val="bullet"/>
+      <w:lvlText w:val=""/>
+      <w:lvlJc w:val="left"/>
+      <w:pPr>
+        <w:tabs>
+          <w:tab w:val="num" w:pos="1800"/>
+        </w:tabs>
+        <w:ind w:left="1800" w:hanging="360"/>
+      </w:pPr>
+      <w:rPr>
+        <w:rFonts w:ascii="Symbol" w:hAnsi="Symbol" w:cs="Symbol" w:hint="default"/>
+      </w:rPr>
     </w:lvl>
     <w:lvl w:ilvl="4">
       <w:start w:val="1"/>
-      <w:numFmt w:val="none"/>
-      <w:suff w:val="nothing"/>
-      <w:lvlText w:val=""/>
-      <w:lvlJc w:val="left"/>
-      <w:pPr>
-        <w:tabs>
-          <w:tab w:val="num" w:pos="0"/>
-        </w:tabs>
-        <w:ind w:left="0" w:hanging="0"/>
-      </w:pPr>
+      <w:numFmt w:val="bullet"/>
+      <w:lvlText w:val="◦"/>
+      <w:lvlJc w:val="left"/>
+      <w:pPr>
+        <w:tabs>
+          <w:tab w:val="num" w:pos="2160"/>
+        </w:tabs>
+        <w:ind w:left="2160" w:hanging="360"/>
+      </w:pPr>
+      <w:rPr>
+        <w:rFonts w:ascii="OpenSymbol" w:hAnsi="OpenSymbol" w:cs="OpenSymbol" w:hint="default"/>
+      </w:rPr>
     </w:lvl>
     <w:lvl w:ilvl="5">
       <w:start w:val="1"/>
-      <w:numFmt w:val="none"/>
-      <w:suff w:val="nothing"/>
-      <w:lvlText w:val=""/>
-      <w:lvlJc w:val="left"/>
-      <w:pPr>
-        <w:tabs>
-          <w:tab w:val="num" w:pos="0"/>
-        </w:tabs>
-        <w:ind w:left="0" w:hanging="0"/>
-      </w:pPr>
+      <w:numFmt w:val="bullet"/>
+      <w:lvlText w:val="▪"/>
+      <w:lvlJc w:val="left"/>
+      <w:pPr>
+        <w:tabs>
+          <w:tab w:val="num" w:pos="2520"/>
+        </w:tabs>
+        <w:ind w:left="2520" w:hanging="360"/>
+      </w:pPr>
+      <w:rPr>
+        <w:rFonts w:ascii="OpenSymbol" w:hAnsi="OpenSymbol" w:cs="OpenSymbol" w:hint="default"/>
+      </w:rPr>
     </w:lvl>
     <w:lvl w:ilvl="6">
       <w:start w:val="1"/>
-      <w:numFmt w:val="none"/>
-      <w:suff w:val="nothing"/>
-      <w:lvlText w:val=""/>
-      <w:lvlJc w:val="left"/>
-      <w:pPr>
-        <w:tabs>
-          <w:tab w:val="num" w:pos="0"/>
-        </w:tabs>
-        <w:ind w:left="0" w:hanging="0"/>
-      </w:pPr>
+      <w:numFmt w:val="bullet"/>
+      <w:lvlText w:val=""/>
+      <w:lvlJc w:val="left"/>
+      <w:pPr>
+        <w:tabs>
+          <w:tab w:val="num" w:pos="2880"/>
+        </w:tabs>
+        <w:ind w:left="2880" w:hanging="360"/>
+      </w:pPr>
+      <w:rPr>
+        <w:rFonts w:ascii="Symbol" w:hAnsi="Symbol" w:cs="Symbol" w:hint="default"/>
+      </w:rPr>
     </w:lvl>
     <w:lvl w:ilvl="7">
       <w:start w:val="1"/>
-      <w:numFmt w:val="none"/>
-      <w:suff w:val="nothing"/>
-      <w:lvlText w:val=""/>
-      <w:lvlJc w:val="left"/>
-      <w:pPr>
-        <w:tabs>
-          <w:tab w:val="num" w:pos="0"/>
-        </w:tabs>
-        <w:ind w:left="0" w:hanging="0"/>
-      </w:pPr>
+      <w:numFmt w:val="bullet"/>
+      <w:lvlText w:val="◦"/>
+      <w:lvlJc w:val="left"/>
+      <w:pPr>
+        <w:tabs>
+          <w:tab w:val="num" w:pos="3240"/>
+        </w:tabs>
+        <w:ind w:left="3240" w:hanging="360"/>
+      </w:pPr>
+      <w:rPr>
+        <w:rFonts w:ascii="OpenSymbol" w:hAnsi="OpenSymbol" w:cs="OpenSymbol" w:hint="default"/>
+      </w:rPr>
     </w:lvl>
     <w:lvl w:ilvl="8">
       <w:start w:val="1"/>
-      <w:numFmt w:val="none"/>
-      <w:suff w:val="nothing"/>
-      <w:lvlText w:val=""/>
-      <w:lvlJc w:val="left"/>
-      <w:pPr>
-        <w:tabs>
-          <w:tab w:val="num" w:pos="0"/>
-        </w:tabs>
-        <w:ind w:left="0" w:hanging="0"/>
-      </w:pPr>
+      <w:numFmt w:val="bullet"/>
+      <w:lvlText w:val="▪"/>
+      <w:lvlJc w:val="left"/>
+      <w:pPr>
+        <w:tabs>
+          <w:tab w:val="num" w:pos="3600"/>
+        </w:tabs>
+        <w:ind w:left="3600" w:hanging="360"/>
+      </w:pPr>
+      <w:rPr>
+        <w:rFonts w:ascii="OpenSymbol" w:hAnsi="OpenSymbol" w:cs="OpenSymbol" w:hint="default"/>
+      </w:rPr>
     </w:lvl>
   </w:abstractNum>
   <w:num w:numId="1">
@@ -1228,6 +1446,13 @@
       <w:u w:val="single"/>
     </w:rPr>
   </w:style>
+  <w:style w:type="character" w:styleId="FollowedHyperlink">
+    <w:name w:val="FollowedHyperlink"/>
+    <w:rPr>
+      <w:color w:val="800000"/>
+      <w:u w:val="single"/>
+    </w:rPr>
+  </w:style>
   <w:style w:type="paragraph" w:styleId="Heading">
     <w:name w:val="Heading"/>
     <w:basedOn w:val="Normal"/>

</xml_diff>